<commit_message>
Record fit type (lme/nlme vs nls fallback) in model tables and Tables S1-S2
Co-Authored-By: Claude Fable 5.1 <noreply@anthropic.com>
Claude-Session: https://claude.ai/code/session_01UbTDViYbpaG5W3TfEhjqAs
</commit_message>
<xml_diff>
--- a/experimental_data_soy_2026/figures/paper_figures/Supplementary_Tables_model_selection.docx
+++ b/experimental_data_soy_2026/figures/paper_figures/Supplementary_Tables_model_selection.docx
@@ -7,7 +7,7 @@
         <w:pStyle w:val="Normal"/>
       </w:pPr>
       <w:r>
-        <w:t xml:space="preserve">Table S1. Candidate models fitted to plant transpiration (TR, mg m⁻² s⁻¹) as a function of vapor pressure deficit (VPD, kPa) for each soybean accession. Linear: TR = a + b₁·VPD; bilinear: slope b₁ up to the breakpoint and b₂ above it; linear-plateau: slope b₁ up to the breakpoint, constant above it. Models were fitted by maximum likelihood with replicate as a random intercept (nlme) to Day 1 measurements and compared by AIC; the model with the lowest AIC (ΔAIC = 0, ✓) was selected. n = number of plant-level observations. “Not converged”: the non-linear fit did not converge from any starting value. WUE class follows Chamarthi et al. (2022); PI398198 is a MAGIC parent.</w:t>
+        <w:t xml:space="preserve">Table S1. Candidate models fitted to plant transpiration (TR, mg m⁻² s⁻¹) as a function of vapor pressure deficit (VPD, kPa) for each soybean accession. Linear: TR = a + b₁·VPD; bilinear: slope b₁ up to the breakpoint and b₂ above it; linear-plateau: slope b₁ up to the breakpoint, constant above it. Models were fitted by maximum likelihood with replicate as a random intercept (nlme) to Day 1 measurements and compared by AIC; the model with the lowest AIC (ΔAIC = 0, ✓) was selected. n = number of plant-level observations. Fit: lme and nlme are mixed models with the replicate random intercept; nls* (no random effect) is the fallback used when the mixed-model fit did not converge from the nls starting values. “Not converged”: the non-linear fit did not converge from any starting value. WUE class follows Chamarthi et al. (2022); PI398198 is a MAGIC parent.</w:t>
       </w:r>
     </w:p>
     <w:tbl xmlns:a="http://schemas.openxmlformats.org/drawingml/2006/main" xmlns:pic="http://schemas.openxmlformats.org/drawingml/2006/picture">
@@ -239,6 +239,50 @@
                 <w:szCs w:val="16"/>
                 <w:color w:val="000000"/>
               </w:rPr>
+              <w:t xml:space="preserve">Fit</w:t>
+            </w:r>
+          </w:p>
+        </w:tc>
+        <w:tc>
+          <w:tcPr>
+            <w:tcBorders>
+              <w:bottom w:val="single" w:sz="8" w:space="0" w:color="000000"/>
+              <w:top w:val="single" w:sz="8" w:space="0" w:color="000000"/>
+              <w:left w:val="none" w:sz="0" w:space="0" w:color="000000"/>
+              <w:right w:val="none" w:sz="0" w:space="0" w:color="000000"/>
+            </w:tcBorders>
+            <w:shd w:val="clear" w:color="auto" w:fill="FFFFFF"/>
+            <w:tcMar>
+              <w:top w:w="0" w:type="dxa"/>
+              <w:bottom w:w="0" w:type="dxa"/>
+              <w:left w:w="0" w:type="dxa"/>
+              <w:right w:w="0" w:type="dxa"/>
+            </w:tcMar>
+            <w:vAlign w:val="center"/>
+          </w:tcPr>
+          <w:p>
+            <w:pPr>
+              <w:pStyle w:val="Normal"/>
+              <w:jc w:val="center"/>
+              <w:pBdr>
+                <w:bottom w:val="none" w:sz="0" w:space="0" w:color="000000"/>
+                <w:top w:val="none" w:sz="0" w:space="0" w:color="000000"/>
+                <w:left w:val="none" w:sz="0" w:space="0" w:color="000000"/>
+                <w:right w:val="none" w:sz="0" w:space="0" w:color="000000"/>
+              </w:pBdr>
+              <w:spacing w:after="40" w:before="40" w:line="240"/>
+              <w:ind w:left="40" w:right="40" w:firstLine="0" w:firstLineChars="0"/>
+            </w:pPr>
+            <w:r>
+              <w:rPr>
+                <w:rFonts w:ascii="Calibri" w:hAnsi="Calibri" w:eastAsia="Calibri" w:cs="Calibri"/>
+                <w:i w:val="false"/>
+                <w:b w:val="false"/>
+                <w:u w:val="none"/>
+                <w:sz w:val="16"/>
+                <w:szCs w:val="16"/>
+                <w:color w:val="000000"/>
+              </w:rPr>
               <w:t xml:space="preserve">Intercept</w:t>
             </w:r>
           </w:p>
@@ -729,6 +773,50 @@
                 <w:szCs w:val="16"/>
                 <w:color w:val="000000"/>
               </w:rPr>
+              <w:t xml:space="preserve">lme</w:t>
+            </w:r>
+          </w:p>
+        </w:tc>
+        <w:tc>
+          <w:tcPr>
+            <w:tcBorders>
+              <w:bottom w:val="none" w:sz="0" w:space="0" w:color="000000"/>
+              <w:top w:val="single" w:sz="8" w:space="0" w:color="000000"/>
+              <w:left w:val="none" w:sz="0" w:space="0" w:color="000000"/>
+              <w:right w:val="none" w:sz="0" w:space="0" w:color="000000"/>
+            </w:tcBorders>
+            <w:shd w:val="clear" w:color="auto" w:fill="FFFFFF"/>
+            <w:tcMar>
+              <w:top w:w="0" w:type="dxa"/>
+              <w:bottom w:w="0" w:type="dxa"/>
+              <w:left w:w="0" w:type="dxa"/>
+              <w:right w:w="0" w:type="dxa"/>
+            </w:tcMar>
+            <w:vAlign w:val="center"/>
+          </w:tcPr>
+          <w:p>
+            <w:pPr>
+              <w:pStyle w:val="Normal"/>
+              <w:jc w:val="center"/>
+              <w:pBdr>
+                <w:bottom w:val="none" w:sz="0" w:space="0" w:color="000000"/>
+                <w:top w:val="none" w:sz="0" w:space="0" w:color="000000"/>
+                <w:left w:val="none" w:sz="0" w:space="0" w:color="000000"/>
+                <w:right w:val="none" w:sz="0" w:space="0" w:color="000000"/>
+              </w:pBdr>
+              <w:spacing w:after="40" w:before="40" w:line="240"/>
+              <w:ind w:left="40" w:right="40" w:firstLine="0" w:firstLineChars="0"/>
+            </w:pPr>
+            <w:r>
+              <w:rPr>
+                <w:rFonts w:ascii="Calibri" w:hAnsi="Calibri" w:eastAsia="Calibri" w:cs="Calibri"/>
+                <w:i w:val="false"/>
+                <w:b w:val="false"/>
+                <w:u w:val="none"/>
+                <w:sz w:val="16"/>
+                <w:szCs w:val="16"/>
+                <w:color w:val="000000"/>
+              </w:rPr>
               <w:t xml:space="preserve">29.3</w:t>
             </w:r>
           </w:p>
@@ -1219,6 +1307,50 @@
                 <w:szCs w:val="16"/>
                 <w:color w:val="000000"/>
               </w:rPr>
+              <w:t xml:space="preserve"/>
+            </w:r>
+          </w:p>
+        </w:tc>
+        <w:tc>
+          <w:tcPr>
+            <w:tcBorders>
+              <w:bottom w:val="none" w:sz="0" w:space="0" w:color="000000"/>
+              <w:top w:val="none" w:sz="0" w:space="0" w:color="000000"/>
+              <w:left w:val="none" w:sz="0" w:space="0" w:color="000000"/>
+              <w:right w:val="none" w:sz="0" w:space="0" w:color="000000"/>
+            </w:tcBorders>
+            <w:shd w:val="clear" w:color="auto" w:fill="FFFFFF"/>
+            <w:tcMar>
+              <w:top w:w="0" w:type="dxa"/>
+              <w:bottom w:w="0" w:type="dxa"/>
+              <w:left w:w="0" w:type="dxa"/>
+              <w:right w:w="0" w:type="dxa"/>
+            </w:tcMar>
+            <w:vAlign w:val="center"/>
+          </w:tcPr>
+          <w:p>
+            <w:pPr>
+              <w:pStyle w:val="Normal"/>
+              <w:jc w:val="center"/>
+              <w:pBdr>
+                <w:bottom w:val="none" w:sz="0" w:space="0" w:color="000000"/>
+                <w:top w:val="none" w:sz="0" w:space="0" w:color="000000"/>
+                <w:left w:val="none" w:sz="0" w:space="0" w:color="000000"/>
+                <w:right w:val="none" w:sz="0" w:space="0" w:color="000000"/>
+              </w:pBdr>
+              <w:spacing w:after="40" w:before="40" w:line="240"/>
+              <w:ind w:left="40" w:right="40" w:firstLine="0" w:firstLineChars="0"/>
+            </w:pPr>
+            <w:r>
+              <w:rPr>
+                <w:rFonts w:ascii="Calibri" w:hAnsi="Calibri" w:eastAsia="Calibri" w:cs="Calibri"/>
+                <w:i w:val="false"/>
+                <w:b w:val="false"/>
+                <w:u w:val="none"/>
+                <w:sz w:val="16"/>
+                <w:szCs w:val="16"/>
+                <w:color w:val="000000"/>
+              </w:rPr>
               <w:t xml:space="preserve">not converged</w:t>
             </w:r>
           </w:p>
@@ -1709,6 +1841,50 @@
                 <w:szCs w:val="16"/>
                 <w:color w:val="000000"/>
               </w:rPr>
+              <w:t xml:space="preserve">nlme</w:t>
+            </w:r>
+          </w:p>
+        </w:tc>
+        <w:tc>
+          <w:tcPr>
+            <w:tcBorders>
+              <w:bottom w:val="single" w:sz="4" w:space="0" w:color="999999"/>
+              <w:top w:val="none" w:sz="0" w:space="0" w:color="000000"/>
+              <w:left w:val="none" w:sz="0" w:space="0" w:color="000000"/>
+              <w:right w:val="none" w:sz="0" w:space="0" w:color="000000"/>
+            </w:tcBorders>
+            <w:shd w:val="clear" w:color="auto" w:fill="FFFFFF"/>
+            <w:tcMar>
+              <w:top w:w="0" w:type="dxa"/>
+              <w:bottom w:w="0" w:type="dxa"/>
+              <w:left w:w="0" w:type="dxa"/>
+              <w:right w:w="0" w:type="dxa"/>
+            </w:tcMar>
+            <w:vAlign w:val="center"/>
+          </w:tcPr>
+          <w:p>
+            <w:pPr>
+              <w:pStyle w:val="Normal"/>
+              <w:jc w:val="center"/>
+              <w:pBdr>
+                <w:bottom w:val="none" w:sz="0" w:space="0" w:color="000000"/>
+                <w:top w:val="none" w:sz="0" w:space="0" w:color="000000"/>
+                <w:left w:val="none" w:sz="0" w:space="0" w:color="000000"/>
+                <w:right w:val="none" w:sz="0" w:space="0" w:color="000000"/>
+              </w:pBdr>
+              <w:spacing w:after="40" w:before="40" w:line="240"/>
+              <w:ind w:left="40" w:right="40" w:firstLine="0" w:firstLineChars="0"/>
+            </w:pPr>
+            <w:r>
+              <w:rPr>
+                <w:rFonts w:ascii="Calibri" w:hAnsi="Calibri" w:eastAsia="Calibri" w:cs="Calibri"/>
+                <w:i w:val="false"/>
+                <w:b w:val="false"/>
+                <w:u w:val="none"/>
+                <w:sz w:val="16"/>
+                <w:szCs w:val="16"/>
+                <w:color w:val="000000"/>
+              </w:rPr>
               <w:t xml:space="preserve">26.1</w:t>
             </w:r>
           </w:p>
@@ -2199,6 +2375,50 @@
                 <w:szCs w:val="16"/>
                 <w:color w:val="000000"/>
               </w:rPr>
+              <w:t xml:space="preserve">lme</w:t>
+            </w:r>
+          </w:p>
+        </w:tc>
+        <w:tc>
+          <w:tcPr>
+            <w:tcBorders>
+              <w:bottom w:val="none" w:sz="0" w:space="0" w:color="000000"/>
+              <w:top w:val="single" w:sz="4" w:space="0" w:color="999999"/>
+              <w:left w:val="none" w:sz="0" w:space="0" w:color="000000"/>
+              <w:right w:val="none" w:sz="0" w:space="0" w:color="000000"/>
+            </w:tcBorders>
+            <w:shd w:val="clear" w:color="auto" w:fill="FFFFFF"/>
+            <w:tcMar>
+              <w:top w:w="0" w:type="dxa"/>
+              <w:bottom w:w="0" w:type="dxa"/>
+              <w:left w:w="0" w:type="dxa"/>
+              <w:right w:w="0" w:type="dxa"/>
+            </w:tcMar>
+            <w:vAlign w:val="center"/>
+          </w:tcPr>
+          <w:p>
+            <w:pPr>
+              <w:pStyle w:val="Normal"/>
+              <w:jc w:val="center"/>
+              <w:pBdr>
+                <w:bottom w:val="none" w:sz="0" w:space="0" w:color="000000"/>
+                <w:top w:val="none" w:sz="0" w:space="0" w:color="000000"/>
+                <w:left w:val="none" w:sz="0" w:space="0" w:color="000000"/>
+                <w:right w:val="none" w:sz="0" w:space="0" w:color="000000"/>
+              </w:pBdr>
+              <w:spacing w:after="40" w:before="40" w:line="240"/>
+              <w:ind w:left="40" w:right="40" w:firstLine="0" w:firstLineChars="0"/>
+            </w:pPr>
+            <w:r>
+              <w:rPr>
+                <w:rFonts w:ascii="Calibri" w:hAnsi="Calibri" w:eastAsia="Calibri" w:cs="Calibri"/>
+                <w:i w:val="false"/>
+                <w:b w:val="false"/>
+                <w:u w:val="none"/>
+                <w:sz w:val="16"/>
+                <w:szCs w:val="16"/>
+                <w:color w:val="000000"/>
+              </w:rPr>
               <w:t xml:space="preserve">26.8</w:t>
             </w:r>
           </w:p>
@@ -2689,6 +2909,50 @@
                 <w:szCs w:val="16"/>
                 <w:color w:val="000000"/>
               </w:rPr>
+              <w:t xml:space="preserve">nlme</w:t>
+            </w:r>
+          </w:p>
+        </w:tc>
+        <w:tc>
+          <w:tcPr>
+            <w:tcBorders>
+              <w:bottom w:val="none" w:sz="0" w:space="0" w:color="000000"/>
+              <w:top w:val="none" w:sz="0" w:space="0" w:color="000000"/>
+              <w:left w:val="none" w:sz="0" w:space="0" w:color="000000"/>
+              <w:right w:val="none" w:sz="0" w:space="0" w:color="000000"/>
+            </w:tcBorders>
+            <w:shd w:val="clear" w:color="auto" w:fill="FFFFFF"/>
+            <w:tcMar>
+              <w:top w:w="0" w:type="dxa"/>
+              <w:bottom w:w="0" w:type="dxa"/>
+              <w:left w:w="0" w:type="dxa"/>
+              <w:right w:w="0" w:type="dxa"/>
+            </w:tcMar>
+            <w:vAlign w:val="center"/>
+          </w:tcPr>
+          <w:p>
+            <w:pPr>
+              <w:pStyle w:val="Normal"/>
+              <w:jc w:val="center"/>
+              <w:pBdr>
+                <w:bottom w:val="none" w:sz="0" w:space="0" w:color="000000"/>
+                <w:top w:val="none" w:sz="0" w:space="0" w:color="000000"/>
+                <w:left w:val="none" w:sz="0" w:space="0" w:color="000000"/>
+                <w:right w:val="none" w:sz="0" w:space="0" w:color="000000"/>
+              </w:pBdr>
+              <w:spacing w:after="40" w:before="40" w:line="240"/>
+              <w:ind w:left="40" w:right="40" w:firstLine="0" w:firstLineChars="0"/>
+            </w:pPr>
+            <w:r>
+              <w:rPr>
+                <w:rFonts w:ascii="Calibri" w:hAnsi="Calibri" w:eastAsia="Calibri" w:cs="Calibri"/>
+                <w:i w:val="false"/>
+                <w:b w:val="false"/>
+                <w:u w:val="none"/>
+                <w:sz w:val="16"/>
+                <w:szCs w:val="16"/>
+                <w:color w:val="000000"/>
+              </w:rPr>
               <w:t xml:space="preserve">4.9</w:t>
             </w:r>
           </w:p>
@@ -3179,6 +3443,50 @@
                 <w:szCs w:val="16"/>
                 <w:color w:val="000000"/>
               </w:rPr>
+              <w:t xml:space="preserve">nlme</w:t>
+            </w:r>
+          </w:p>
+        </w:tc>
+        <w:tc>
+          <w:tcPr>
+            <w:tcBorders>
+              <w:bottom w:val="single" w:sz="4" w:space="0" w:color="999999"/>
+              <w:top w:val="none" w:sz="0" w:space="0" w:color="000000"/>
+              <w:left w:val="none" w:sz="0" w:space="0" w:color="000000"/>
+              <w:right w:val="none" w:sz="0" w:space="0" w:color="000000"/>
+            </w:tcBorders>
+            <w:shd w:val="clear" w:color="auto" w:fill="FFFFFF"/>
+            <w:tcMar>
+              <w:top w:w="0" w:type="dxa"/>
+              <w:bottom w:w="0" w:type="dxa"/>
+              <w:left w:w="0" w:type="dxa"/>
+              <w:right w:w="0" w:type="dxa"/>
+            </w:tcMar>
+            <w:vAlign w:val="center"/>
+          </w:tcPr>
+          <w:p>
+            <w:pPr>
+              <w:pStyle w:val="Normal"/>
+              <w:jc w:val="center"/>
+              <w:pBdr>
+                <w:bottom w:val="none" w:sz="0" w:space="0" w:color="000000"/>
+                <w:top w:val="none" w:sz="0" w:space="0" w:color="000000"/>
+                <w:left w:val="none" w:sz="0" w:space="0" w:color="000000"/>
+                <w:right w:val="none" w:sz="0" w:space="0" w:color="000000"/>
+              </w:pBdr>
+              <w:spacing w:after="40" w:before="40" w:line="240"/>
+              <w:ind w:left="40" w:right="40" w:firstLine="0" w:firstLineChars="0"/>
+            </w:pPr>
+            <w:r>
+              <w:rPr>
+                <w:rFonts w:ascii="Calibri" w:hAnsi="Calibri" w:eastAsia="Calibri" w:cs="Calibri"/>
+                <w:i w:val="false"/>
+                <w:b w:val="false"/>
+                <w:u w:val="none"/>
+                <w:sz w:val="16"/>
+                <w:szCs w:val="16"/>
+                <w:color w:val="000000"/>
+              </w:rPr>
               <w:t xml:space="preserve">23.7</w:t>
             </w:r>
           </w:p>
@@ -3669,6 +3977,50 @@
                 <w:szCs w:val="16"/>
                 <w:color w:val="000000"/>
               </w:rPr>
+              <w:t xml:space="preserve">lme</w:t>
+            </w:r>
+          </w:p>
+        </w:tc>
+        <w:tc>
+          <w:tcPr>
+            <w:tcBorders>
+              <w:bottom w:val="none" w:sz="0" w:space="0" w:color="000000"/>
+              <w:top w:val="single" w:sz="4" w:space="0" w:color="999999"/>
+              <w:left w:val="none" w:sz="0" w:space="0" w:color="000000"/>
+              <w:right w:val="none" w:sz="0" w:space="0" w:color="000000"/>
+            </w:tcBorders>
+            <w:shd w:val="clear" w:color="auto" w:fill="FFFFFF"/>
+            <w:tcMar>
+              <w:top w:w="0" w:type="dxa"/>
+              <w:bottom w:w="0" w:type="dxa"/>
+              <w:left w:w="0" w:type="dxa"/>
+              <w:right w:w="0" w:type="dxa"/>
+            </w:tcMar>
+            <w:vAlign w:val="center"/>
+          </w:tcPr>
+          <w:p>
+            <w:pPr>
+              <w:pStyle w:val="Normal"/>
+              <w:jc w:val="center"/>
+              <w:pBdr>
+                <w:bottom w:val="none" w:sz="0" w:space="0" w:color="000000"/>
+                <w:top w:val="none" w:sz="0" w:space="0" w:color="000000"/>
+                <w:left w:val="none" w:sz="0" w:space="0" w:color="000000"/>
+                <w:right w:val="none" w:sz="0" w:space="0" w:color="000000"/>
+              </w:pBdr>
+              <w:spacing w:after="40" w:before="40" w:line="240"/>
+              <w:ind w:left="40" w:right="40" w:firstLine="0" w:firstLineChars="0"/>
+            </w:pPr>
+            <w:r>
+              <w:rPr>
+                <w:rFonts w:ascii="Calibri" w:hAnsi="Calibri" w:eastAsia="Calibri" w:cs="Calibri"/>
+                <w:i w:val="false"/>
+                <w:b w:val="false"/>
+                <w:u w:val="none"/>
+                <w:sz w:val="16"/>
+                <w:szCs w:val="16"/>
+                <w:color w:val="000000"/>
+              </w:rPr>
               <w:t xml:space="preserve">31.0</w:t>
             </w:r>
           </w:p>
@@ -4159,6 +4511,50 @@
                 <w:szCs w:val="16"/>
                 <w:color w:val="000000"/>
               </w:rPr>
+              <w:t xml:space="preserve">nls*</w:t>
+            </w:r>
+          </w:p>
+        </w:tc>
+        <w:tc>
+          <w:tcPr>
+            <w:tcBorders>
+              <w:bottom w:val="none" w:sz="0" w:space="0" w:color="000000"/>
+              <w:top w:val="none" w:sz="0" w:space="0" w:color="000000"/>
+              <w:left w:val="none" w:sz="0" w:space="0" w:color="000000"/>
+              <w:right w:val="none" w:sz="0" w:space="0" w:color="000000"/>
+            </w:tcBorders>
+            <w:shd w:val="clear" w:color="auto" w:fill="FFFFFF"/>
+            <w:tcMar>
+              <w:top w:w="0" w:type="dxa"/>
+              <w:bottom w:w="0" w:type="dxa"/>
+              <w:left w:w="0" w:type="dxa"/>
+              <w:right w:w="0" w:type="dxa"/>
+            </w:tcMar>
+            <w:vAlign w:val="center"/>
+          </w:tcPr>
+          <w:p>
+            <w:pPr>
+              <w:pStyle w:val="Normal"/>
+              <w:jc w:val="center"/>
+              <w:pBdr>
+                <w:bottom w:val="none" w:sz="0" w:space="0" w:color="000000"/>
+                <w:top w:val="none" w:sz="0" w:space="0" w:color="000000"/>
+                <w:left w:val="none" w:sz="0" w:space="0" w:color="000000"/>
+                <w:right w:val="none" w:sz="0" w:space="0" w:color="000000"/>
+              </w:pBdr>
+              <w:spacing w:after="40" w:before="40" w:line="240"/>
+              <w:ind w:left="40" w:right="40" w:firstLine="0" w:firstLineChars="0"/>
+            </w:pPr>
+            <w:r>
+              <w:rPr>
+                <w:rFonts w:ascii="Calibri" w:hAnsi="Calibri" w:eastAsia="Calibri" w:cs="Calibri"/>
+                <w:i w:val="false"/>
+                <w:b w:val="false"/>
+                <w:u w:val="none"/>
+                <w:sz w:val="16"/>
+                <w:szCs w:val="16"/>
+                <w:color w:val="000000"/>
+              </w:rPr>
               <w:t xml:space="preserve">28.0</w:t>
             </w:r>
           </w:p>
@@ -4649,6 +5045,50 @@
                 <w:szCs w:val="16"/>
                 <w:color w:val="000000"/>
               </w:rPr>
+              <w:t xml:space="preserve">nlme</w:t>
+            </w:r>
+          </w:p>
+        </w:tc>
+        <w:tc>
+          <w:tcPr>
+            <w:tcBorders>
+              <w:bottom w:val="single" w:sz="4" w:space="0" w:color="999999"/>
+              <w:top w:val="none" w:sz="0" w:space="0" w:color="000000"/>
+              <w:left w:val="none" w:sz="0" w:space="0" w:color="000000"/>
+              <w:right w:val="none" w:sz="0" w:space="0" w:color="000000"/>
+            </w:tcBorders>
+            <w:shd w:val="clear" w:color="auto" w:fill="FFFFFF"/>
+            <w:tcMar>
+              <w:top w:w="0" w:type="dxa"/>
+              <w:bottom w:w="0" w:type="dxa"/>
+              <w:left w:w="0" w:type="dxa"/>
+              <w:right w:w="0" w:type="dxa"/>
+            </w:tcMar>
+            <w:vAlign w:val="center"/>
+          </w:tcPr>
+          <w:p>
+            <w:pPr>
+              <w:pStyle w:val="Normal"/>
+              <w:jc w:val="center"/>
+              <w:pBdr>
+                <w:bottom w:val="none" w:sz="0" w:space="0" w:color="000000"/>
+                <w:top w:val="none" w:sz="0" w:space="0" w:color="000000"/>
+                <w:left w:val="none" w:sz="0" w:space="0" w:color="000000"/>
+                <w:right w:val="none" w:sz="0" w:space="0" w:color="000000"/>
+              </w:pBdr>
+              <w:spacing w:after="40" w:before="40" w:line="240"/>
+              <w:ind w:left="40" w:right="40" w:firstLine="0" w:firstLineChars="0"/>
+            </w:pPr>
+            <w:r>
+              <w:rPr>
+                <w:rFonts w:ascii="Calibri" w:hAnsi="Calibri" w:eastAsia="Calibri" w:cs="Calibri"/>
+                <w:i w:val="false"/>
+                <w:b w:val="false"/>
+                <w:u w:val="none"/>
+                <w:sz w:val="16"/>
+                <w:szCs w:val="16"/>
+                <w:color w:val="000000"/>
+              </w:rPr>
               <w:t xml:space="preserve">27.3</w:t>
             </w:r>
           </w:p>
@@ -5139,6 +5579,50 @@
                 <w:szCs w:val="16"/>
                 <w:color w:val="000000"/>
               </w:rPr>
+              <w:t xml:space="preserve">lme</w:t>
+            </w:r>
+          </w:p>
+        </w:tc>
+        <w:tc>
+          <w:tcPr>
+            <w:tcBorders>
+              <w:bottom w:val="none" w:sz="0" w:space="0" w:color="000000"/>
+              <w:top w:val="single" w:sz="4" w:space="0" w:color="999999"/>
+              <w:left w:val="none" w:sz="0" w:space="0" w:color="000000"/>
+              <w:right w:val="none" w:sz="0" w:space="0" w:color="000000"/>
+            </w:tcBorders>
+            <w:shd w:val="clear" w:color="auto" w:fill="FFFFFF"/>
+            <w:tcMar>
+              <w:top w:w="0" w:type="dxa"/>
+              <w:bottom w:w="0" w:type="dxa"/>
+              <w:left w:w="0" w:type="dxa"/>
+              <w:right w:w="0" w:type="dxa"/>
+            </w:tcMar>
+            <w:vAlign w:val="center"/>
+          </w:tcPr>
+          <w:p>
+            <w:pPr>
+              <w:pStyle w:val="Normal"/>
+              <w:jc w:val="center"/>
+              <w:pBdr>
+                <w:bottom w:val="none" w:sz="0" w:space="0" w:color="000000"/>
+                <w:top w:val="none" w:sz="0" w:space="0" w:color="000000"/>
+                <w:left w:val="none" w:sz="0" w:space="0" w:color="000000"/>
+                <w:right w:val="none" w:sz="0" w:space="0" w:color="000000"/>
+              </w:pBdr>
+              <w:spacing w:after="40" w:before="40" w:line="240"/>
+              <w:ind w:left="40" w:right="40" w:firstLine="0" w:firstLineChars="0"/>
+            </w:pPr>
+            <w:r>
+              <w:rPr>
+                <w:rFonts w:ascii="Calibri" w:hAnsi="Calibri" w:eastAsia="Calibri" w:cs="Calibri"/>
+                <w:i w:val="false"/>
+                <w:b w:val="false"/>
+                <w:u w:val="none"/>
+                <w:sz w:val="16"/>
+                <w:szCs w:val="16"/>
+                <w:color w:val="000000"/>
+              </w:rPr>
               <w:t xml:space="preserve">33.3</w:t>
             </w:r>
           </w:p>
@@ -5629,6 +6113,50 @@
                 <w:szCs w:val="16"/>
                 <w:color w:val="000000"/>
               </w:rPr>
+              <w:t xml:space="preserve">nlme</w:t>
+            </w:r>
+          </w:p>
+        </w:tc>
+        <w:tc>
+          <w:tcPr>
+            <w:tcBorders>
+              <w:bottom w:val="none" w:sz="0" w:space="0" w:color="000000"/>
+              <w:top w:val="none" w:sz="0" w:space="0" w:color="000000"/>
+              <w:left w:val="none" w:sz="0" w:space="0" w:color="000000"/>
+              <w:right w:val="none" w:sz="0" w:space="0" w:color="000000"/>
+            </w:tcBorders>
+            <w:shd w:val="clear" w:color="auto" w:fill="FFFFFF"/>
+            <w:tcMar>
+              <w:top w:w="0" w:type="dxa"/>
+              <w:bottom w:w="0" w:type="dxa"/>
+              <w:left w:w="0" w:type="dxa"/>
+              <w:right w:w="0" w:type="dxa"/>
+            </w:tcMar>
+            <w:vAlign w:val="center"/>
+          </w:tcPr>
+          <w:p>
+            <w:pPr>
+              <w:pStyle w:val="Normal"/>
+              <w:jc w:val="center"/>
+              <w:pBdr>
+                <w:bottom w:val="none" w:sz="0" w:space="0" w:color="000000"/>
+                <w:top w:val="none" w:sz="0" w:space="0" w:color="000000"/>
+                <w:left w:val="none" w:sz="0" w:space="0" w:color="000000"/>
+                <w:right w:val="none" w:sz="0" w:space="0" w:color="000000"/>
+              </w:pBdr>
+              <w:spacing w:after="40" w:before="40" w:line="240"/>
+              <w:ind w:left="40" w:right="40" w:firstLine="0" w:firstLineChars="0"/>
+            </w:pPr>
+            <w:r>
+              <w:rPr>
+                <w:rFonts w:ascii="Calibri" w:hAnsi="Calibri" w:eastAsia="Calibri" w:cs="Calibri"/>
+                <w:i w:val="false"/>
+                <w:b w:val="false"/>
+                <w:u w:val="none"/>
+                <w:sz w:val="16"/>
+                <w:szCs w:val="16"/>
+                <w:color w:val="000000"/>
+              </w:rPr>
               <w:t xml:space="preserve">25.4</w:t>
             </w:r>
           </w:p>
@@ -6119,6 +6647,50 @@
                 <w:szCs w:val="16"/>
                 <w:color w:val="000000"/>
               </w:rPr>
+              <w:t xml:space="preserve">nlme</w:t>
+            </w:r>
+          </w:p>
+        </w:tc>
+        <w:tc>
+          <w:tcPr>
+            <w:tcBorders>
+              <w:bottom w:val="single" w:sz="4" w:space="0" w:color="999999"/>
+              <w:top w:val="none" w:sz="0" w:space="0" w:color="000000"/>
+              <w:left w:val="none" w:sz="0" w:space="0" w:color="000000"/>
+              <w:right w:val="none" w:sz="0" w:space="0" w:color="000000"/>
+            </w:tcBorders>
+            <w:shd w:val="clear" w:color="auto" w:fill="FFFFFF"/>
+            <w:tcMar>
+              <w:top w:w="0" w:type="dxa"/>
+              <w:bottom w:w="0" w:type="dxa"/>
+              <w:left w:w="0" w:type="dxa"/>
+              <w:right w:w="0" w:type="dxa"/>
+            </w:tcMar>
+            <w:vAlign w:val="center"/>
+          </w:tcPr>
+          <w:p>
+            <w:pPr>
+              <w:pStyle w:val="Normal"/>
+              <w:jc w:val="center"/>
+              <w:pBdr>
+                <w:bottom w:val="none" w:sz="0" w:space="0" w:color="000000"/>
+                <w:top w:val="none" w:sz="0" w:space="0" w:color="000000"/>
+                <w:left w:val="none" w:sz="0" w:space="0" w:color="000000"/>
+                <w:right w:val="none" w:sz="0" w:space="0" w:color="000000"/>
+              </w:pBdr>
+              <w:spacing w:after="40" w:before="40" w:line="240"/>
+              <w:ind w:left="40" w:right="40" w:firstLine="0" w:firstLineChars="0"/>
+            </w:pPr>
+            <w:r>
+              <w:rPr>
+                <w:rFonts w:ascii="Calibri" w:hAnsi="Calibri" w:eastAsia="Calibri" w:cs="Calibri"/>
+                <w:i w:val="false"/>
+                <w:b w:val="false"/>
+                <w:u w:val="none"/>
+                <w:sz w:val="16"/>
+                <w:szCs w:val="16"/>
+                <w:color w:val="000000"/>
+              </w:rPr>
               <w:t xml:space="preserve">25.6</w:t>
             </w:r>
           </w:p>
@@ -6609,6 +7181,50 @@
                 <w:szCs w:val="16"/>
                 <w:color w:val="000000"/>
               </w:rPr>
+              <w:t xml:space="preserve">lme</w:t>
+            </w:r>
+          </w:p>
+        </w:tc>
+        <w:tc>
+          <w:tcPr>
+            <w:tcBorders>
+              <w:bottom w:val="none" w:sz="0" w:space="0" w:color="000000"/>
+              <w:top w:val="single" w:sz="4" w:space="0" w:color="999999"/>
+              <w:left w:val="none" w:sz="0" w:space="0" w:color="000000"/>
+              <w:right w:val="none" w:sz="0" w:space="0" w:color="000000"/>
+            </w:tcBorders>
+            <w:shd w:val="clear" w:color="auto" w:fill="FFFFFF"/>
+            <w:tcMar>
+              <w:top w:w="0" w:type="dxa"/>
+              <w:bottom w:w="0" w:type="dxa"/>
+              <w:left w:w="0" w:type="dxa"/>
+              <w:right w:w="0" w:type="dxa"/>
+            </w:tcMar>
+            <w:vAlign w:val="center"/>
+          </w:tcPr>
+          <w:p>
+            <w:pPr>
+              <w:pStyle w:val="Normal"/>
+              <w:jc w:val="center"/>
+              <w:pBdr>
+                <w:bottom w:val="none" w:sz="0" w:space="0" w:color="000000"/>
+                <w:top w:val="none" w:sz="0" w:space="0" w:color="000000"/>
+                <w:left w:val="none" w:sz="0" w:space="0" w:color="000000"/>
+                <w:right w:val="none" w:sz="0" w:space="0" w:color="000000"/>
+              </w:pBdr>
+              <w:spacing w:after="40" w:before="40" w:line="240"/>
+              <w:ind w:left="40" w:right="40" w:firstLine="0" w:firstLineChars="0"/>
+            </w:pPr>
+            <w:r>
+              <w:rPr>
+                <w:rFonts w:ascii="Calibri" w:hAnsi="Calibri" w:eastAsia="Calibri" w:cs="Calibri"/>
+                <w:i w:val="false"/>
+                <w:b w:val="false"/>
+                <w:u w:val="none"/>
+                <w:sz w:val="16"/>
+                <w:szCs w:val="16"/>
+                <w:color w:val="000000"/>
+              </w:rPr>
               <w:t xml:space="preserve">34.6</w:t>
             </w:r>
           </w:p>
@@ -7099,6 +7715,50 @@
                 <w:szCs w:val="16"/>
                 <w:color w:val="000000"/>
               </w:rPr>
+              <w:t xml:space="preserve">nlme</w:t>
+            </w:r>
+          </w:p>
+        </w:tc>
+        <w:tc>
+          <w:tcPr>
+            <w:tcBorders>
+              <w:bottom w:val="none" w:sz="0" w:space="0" w:color="000000"/>
+              <w:top w:val="none" w:sz="0" w:space="0" w:color="000000"/>
+              <w:left w:val="none" w:sz="0" w:space="0" w:color="000000"/>
+              <w:right w:val="none" w:sz="0" w:space="0" w:color="000000"/>
+            </w:tcBorders>
+            <w:shd w:val="clear" w:color="auto" w:fill="FFFFFF"/>
+            <w:tcMar>
+              <w:top w:w="0" w:type="dxa"/>
+              <w:bottom w:w="0" w:type="dxa"/>
+              <w:left w:w="0" w:type="dxa"/>
+              <w:right w:w="0" w:type="dxa"/>
+            </w:tcMar>
+            <w:vAlign w:val="center"/>
+          </w:tcPr>
+          <w:p>
+            <w:pPr>
+              <w:pStyle w:val="Normal"/>
+              <w:jc w:val="center"/>
+              <w:pBdr>
+                <w:bottom w:val="none" w:sz="0" w:space="0" w:color="000000"/>
+                <w:top w:val="none" w:sz="0" w:space="0" w:color="000000"/>
+                <w:left w:val="none" w:sz="0" w:space="0" w:color="000000"/>
+                <w:right w:val="none" w:sz="0" w:space="0" w:color="000000"/>
+              </w:pBdr>
+              <w:spacing w:after="40" w:before="40" w:line="240"/>
+              <w:ind w:left="40" w:right="40" w:firstLine="0" w:firstLineChars="0"/>
+            </w:pPr>
+            <w:r>
+              <w:rPr>
+                <w:rFonts w:ascii="Calibri" w:hAnsi="Calibri" w:eastAsia="Calibri" w:cs="Calibri"/>
+                <w:i w:val="false"/>
+                <w:b w:val="false"/>
+                <w:u w:val="none"/>
+                <w:sz w:val="16"/>
+                <w:szCs w:val="16"/>
+                <w:color w:val="000000"/>
+              </w:rPr>
               <w:t xml:space="preserve">29.0</w:t>
             </w:r>
           </w:p>
@@ -7589,6 +8249,50 @@
                 <w:szCs w:val="16"/>
                 <w:color w:val="000000"/>
               </w:rPr>
+              <w:t xml:space="preserve">nlme</w:t>
+            </w:r>
+          </w:p>
+        </w:tc>
+        <w:tc>
+          <w:tcPr>
+            <w:tcBorders>
+              <w:bottom w:val="single" w:sz="4" w:space="0" w:color="999999"/>
+              <w:top w:val="none" w:sz="0" w:space="0" w:color="000000"/>
+              <w:left w:val="none" w:sz="0" w:space="0" w:color="000000"/>
+              <w:right w:val="none" w:sz="0" w:space="0" w:color="000000"/>
+            </w:tcBorders>
+            <w:shd w:val="clear" w:color="auto" w:fill="FFFFFF"/>
+            <w:tcMar>
+              <w:top w:w="0" w:type="dxa"/>
+              <w:bottom w:w="0" w:type="dxa"/>
+              <w:left w:w="0" w:type="dxa"/>
+              <w:right w:w="0" w:type="dxa"/>
+            </w:tcMar>
+            <w:vAlign w:val="center"/>
+          </w:tcPr>
+          <w:p>
+            <w:pPr>
+              <w:pStyle w:val="Normal"/>
+              <w:jc w:val="center"/>
+              <w:pBdr>
+                <w:bottom w:val="none" w:sz="0" w:space="0" w:color="000000"/>
+                <w:top w:val="none" w:sz="0" w:space="0" w:color="000000"/>
+                <w:left w:val="none" w:sz="0" w:space="0" w:color="000000"/>
+                <w:right w:val="none" w:sz="0" w:space="0" w:color="000000"/>
+              </w:pBdr>
+              <w:spacing w:after="40" w:before="40" w:line="240"/>
+              <w:ind w:left="40" w:right="40" w:firstLine="0" w:firstLineChars="0"/>
+            </w:pPr>
+            <w:r>
+              <w:rPr>
+                <w:rFonts w:ascii="Calibri" w:hAnsi="Calibri" w:eastAsia="Calibri" w:cs="Calibri"/>
+                <w:i w:val="false"/>
+                <w:b w:val="false"/>
+                <w:u w:val="none"/>
+                <w:sz w:val="16"/>
+                <w:szCs w:val="16"/>
+                <w:color w:val="000000"/>
+              </w:rPr>
               <w:t xml:space="preserve">27.4</w:t>
             </w:r>
           </w:p>
@@ -8079,6 +8783,50 @@
                 <w:szCs w:val="16"/>
                 <w:color w:val="000000"/>
               </w:rPr>
+              <w:t xml:space="preserve">lme</w:t>
+            </w:r>
+          </w:p>
+        </w:tc>
+        <w:tc>
+          <w:tcPr>
+            <w:tcBorders>
+              <w:bottom w:val="none" w:sz="0" w:space="0" w:color="000000"/>
+              <w:top w:val="single" w:sz="4" w:space="0" w:color="999999"/>
+              <w:left w:val="none" w:sz="0" w:space="0" w:color="000000"/>
+              <w:right w:val="none" w:sz="0" w:space="0" w:color="000000"/>
+            </w:tcBorders>
+            <w:shd w:val="clear" w:color="auto" w:fill="FFFFFF"/>
+            <w:tcMar>
+              <w:top w:w="0" w:type="dxa"/>
+              <w:bottom w:w="0" w:type="dxa"/>
+              <w:left w:w="0" w:type="dxa"/>
+              <w:right w:w="0" w:type="dxa"/>
+            </w:tcMar>
+            <w:vAlign w:val="center"/>
+          </w:tcPr>
+          <w:p>
+            <w:pPr>
+              <w:pStyle w:val="Normal"/>
+              <w:jc w:val="center"/>
+              <w:pBdr>
+                <w:bottom w:val="none" w:sz="0" w:space="0" w:color="000000"/>
+                <w:top w:val="none" w:sz="0" w:space="0" w:color="000000"/>
+                <w:left w:val="none" w:sz="0" w:space="0" w:color="000000"/>
+                <w:right w:val="none" w:sz="0" w:space="0" w:color="000000"/>
+              </w:pBdr>
+              <w:spacing w:after="40" w:before="40" w:line="240"/>
+              <w:ind w:left="40" w:right="40" w:firstLine="0" w:firstLineChars="0"/>
+            </w:pPr>
+            <w:r>
+              <w:rPr>
+                <w:rFonts w:ascii="Calibri" w:hAnsi="Calibri" w:eastAsia="Calibri" w:cs="Calibri"/>
+                <w:i w:val="false"/>
+                <w:b w:val="false"/>
+                <w:u w:val="none"/>
+                <w:sz w:val="16"/>
+                <w:szCs w:val="16"/>
+                <w:color w:val="000000"/>
+              </w:rPr>
               <w:t xml:space="preserve">31.2</w:t>
             </w:r>
           </w:p>
@@ -8569,6 +9317,50 @@
                 <w:szCs w:val="16"/>
                 <w:color w:val="000000"/>
               </w:rPr>
+              <w:t xml:space="preserve">nlme</w:t>
+            </w:r>
+          </w:p>
+        </w:tc>
+        <w:tc>
+          <w:tcPr>
+            <w:tcBorders>
+              <w:bottom w:val="none" w:sz="0" w:space="0" w:color="000000"/>
+              <w:top w:val="none" w:sz="0" w:space="0" w:color="000000"/>
+              <w:left w:val="none" w:sz="0" w:space="0" w:color="000000"/>
+              <w:right w:val="none" w:sz="0" w:space="0" w:color="000000"/>
+            </w:tcBorders>
+            <w:shd w:val="clear" w:color="auto" w:fill="FFFFFF"/>
+            <w:tcMar>
+              <w:top w:w="0" w:type="dxa"/>
+              <w:bottom w:w="0" w:type="dxa"/>
+              <w:left w:w="0" w:type="dxa"/>
+              <w:right w:w="0" w:type="dxa"/>
+            </w:tcMar>
+            <w:vAlign w:val="center"/>
+          </w:tcPr>
+          <w:p>
+            <w:pPr>
+              <w:pStyle w:val="Normal"/>
+              <w:jc w:val="center"/>
+              <w:pBdr>
+                <w:bottom w:val="none" w:sz="0" w:space="0" w:color="000000"/>
+                <w:top w:val="none" w:sz="0" w:space="0" w:color="000000"/>
+                <w:left w:val="none" w:sz="0" w:space="0" w:color="000000"/>
+                <w:right w:val="none" w:sz="0" w:space="0" w:color="000000"/>
+              </w:pBdr>
+              <w:spacing w:after="40" w:before="40" w:line="240"/>
+              <w:ind w:left="40" w:right="40" w:firstLine="0" w:firstLineChars="0"/>
+            </w:pPr>
+            <w:r>
+              <w:rPr>
+                <w:rFonts w:ascii="Calibri" w:hAnsi="Calibri" w:eastAsia="Calibri" w:cs="Calibri"/>
+                <w:i w:val="false"/>
+                <w:b w:val="false"/>
+                <w:u w:val="none"/>
+                <w:sz w:val="16"/>
+                <w:szCs w:val="16"/>
+                <w:color w:val="000000"/>
+              </w:rPr>
               <w:t xml:space="preserve">11.5</w:t>
             </w:r>
           </w:p>
@@ -9059,6 +9851,50 @@
                 <w:szCs w:val="16"/>
                 <w:color w:val="000000"/>
               </w:rPr>
+              <w:t xml:space="preserve">nlme</w:t>
+            </w:r>
+          </w:p>
+        </w:tc>
+        <w:tc>
+          <w:tcPr>
+            <w:tcBorders>
+              <w:bottom w:val="single" w:sz="4" w:space="0" w:color="999999"/>
+              <w:top w:val="none" w:sz="0" w:space="0" w:color="000000"/>
+              <w:left w:val="none" w:sz="0" w:space="0" w:color="000000"/>
+              <w:right w:val="none" w:sz="0" w:space="0" w:color="000000"/>
+            </w:tcBorders>
+            <w:shd w:val="clear" w:color="auto" w:fill="FFFFFF"/>
+            <w:tcMar>
+              <w:top w:w="0" w:type="dxa"/>
+              <w:bottom w:w="0" w:type="dxa"/>
+              <w:left w:w="0" w:type="dxa"/>
+              <w:right w:w="0" w:type="dxa"/>
+            </w:tcMar>
+            <w:vAlign w:val="center"/>
+          </w:tcPr>
+          <w:p>
+            <w:pPr>
+              <w:pStyle w:val="Normal"/>
+              <w:jc w:val="center"/>
+              <w:pBdr>
+                <w:bottom w:val="none" w:sz="0" w:space="0" w:color="000000"/>
+                <w:top w:val="none" w:sz="0" w:space="0" w:color="000000"/>
+                <w:left w:val="none" w:sz="0" w:space="0" w:color="000000"/>
+                <w:right w:val="none" w:sz="0" w:space="0" w:color="000000"/>
+              </w:pBdr>
+              <w:spacing w:after="40" w:before="40" w:line="240"/>
+              <w:ind w:left="40" w:right="40" w:firstLine="0" w:firstLineChars="0"/>
+            </w:pPr>
+            <w:r>
+              <w:rPr>
+                <w:rFonts w:ascii="Calibri" w:hAnsi="Calibri" w:eastAsia="Calibri" w:cs="Calibri"/>
+                <w:i w:val="false"/>
+                <w:b w:val="false"/>
+                <w:u w:val="none"/>
+                <w:sz w:val="16"/>
+                <w:szCs w:val="16"/>
+                <w:color w:val="000000"/>
+              </w:rPr>
               <w:t xml:space="preserve">11.5</w:t>
             </w:r>
           </w:p>
@@ -9549,6 +10385,50 @@
                 <w:szCs w:val="16"/>
                 <w:color w:val="000000"/>
               </w:rPr>
+              <w:t xml:space="preserve">lme</w:t>
+            </w:r>
+          </w:p>
+        </w:tc>
+        <w:tc>
+          <w:tcPr>
+            <w:tcBorders>
+              <w:bottom w:val="none" w:sz="0" w:space="0" w:color="000000"/>
+              <w:top w:val="single" w:sz="4" w:space="0" w:color="999999"/>
+              <w:left w:val="none" w:sz="0" w:space="0" w:color="000000"/>
+              <w:right w:val="none" w:sz="0" w:space="0" w:color="000000"/>
+            </w:tcBorders>
+            <w:shd w:val="clear" w:color="auto" w:fill="FFFFFF"/>
+            <w:tcMar>
+              <w:top w:w="0" w:type="dxa"/>
+              <w:bottom w:w="0" w:type="dxa"/>
+              <w:left w:w="0" w:type="dxa"/>
+              <w:right w:w="0" w:type="dxa"/>
+            </w:tcMar>
+            <w:vAlign w:val="center"/>
+          </w:tcPr>
+          <w:p>
+            <w:pPr>
+              <w:pStyle w:val="Normal"/>
+              <w:jc w:val="center"/>
+              <w:pBdr>
+                <w:bottom w:val="none" w:sz="0" w:space="0" w:color="000000"/>
+                <w:top w:val="none" w:sz="0" w:space="0" w:color="000000"/>
+                <w:left w:val="none" w:sz="0" w:space="0" w:color="000000"/>
+                <w:right w:val="none" w:sz="0" w:space="0" w:color="000000"/>
+              </w:pBdr>
+              <w:spacing w:after="40" w:before="40" w:line="240"/>
+              <w:ind w:left="40" w:right="40" w:firstLine="0" w:firstLineChars="0"/>
+            </w:pPr>
+            <w:r>
+              <w:rPr>
+                <w:rFonts w:ascii="Calibri" w:hAnsi="Calibri" w:eastAsia="Calibri" w:cs="Calibri"/>
+                <w:i w:val="false"/>
+                <w:b w:val="false"/>
+                <w:u w:val="none"/>
+                <w:sz w:val="16"/>
+                <w:szCs w:val="16"/>
+                <w:color w:val="000000"/>
+              </w:rPr>
               <w:t xml:space="preserve">30.6</w:t>
             </w:r>
           </w:p>
@@ -10039,6 +10919,50 @@
                 <w:szCs w:val="16"/>
                 <w:color w:val="000000"/>
               </w:rPr>
+              <w:t xml:space="preserve"/>
+            </w:r>
+          </w:p>
+        </w:tc>
+        <w:tc>
+          <w:tcPr>
+            <w:tcBorders>
+              <w:bottom w:val="none" w:sz="0" w:space="0" w:color="000000"/>
+              <w:top w:val="none" w:sz="0" w:space="0" w:color="000000"/>
+              <w:left w:val="none" w:sz="0" w:space="0" w:color="000000"/>
+              <w:right w:val="none" w:sz="0" w:space="0" w:color="000000"/>
+            </w:tcBorders>
+            <w:shd w:val="clear" w:color="auto" w:fill="FFFFFF"/>
+            <w:tcMar>
+              <w:top w:w="0" w:type="dxa"/>
+              <w:bottom w:w="0" w:type="dxa"/>
+              <w:left w:w="0" w:type="dxa"/>
+              <w:right w:w="0" w:type="dxa"/>
+            </w:tcMar>
+            <w:vAlign w:val="center"/>
+          </w:tcPr>
+          <w:p>
+            <w:pPr>
+              <w:pStyle w:val="Normal"/>
+              <w:jc w:val="center"/>
+              <w:pBdr>
+                <w:bottom w:val="none" w:sz="0" w:space="0" w:color="000000"/>
+                <w:top w:val="none" w:sz="0" w:space="0" w:color="000000"/>
+                <w:left w:val="none" w:sz="0" w:space="0" w:color="000000"/>
+                <w:right w:val="none" w:sz="0" w:space="0" w:color="000000"/>
+              </w:pBdr>
+              <w:spacing w:after="40" w:before="40" w:line="240"/>
+              <w:ind w:left="40" w:right="40" w:firstLine="0" w:firstLineChars="0"/>
+            </w:pPr>
+            <w:r>
+              <w:rPr>
+                <w:rFonts w:ascii="Calibri" w:hAnsi="Calibri" w:eastAsia="Calibri" w:cs="Calibri"/>
+                <w:i w:val="false"/>
+                <w:b w:val="false"/>
+                <w:u w:val="none"/>
+                <w:sz w:val="16"/>
+                <w:szCs w:val="16"/>
+                <w:color w:val="000000"/>
+              </w:rPr>
               <w:t xml:space="preserve">not converged</w:t>
             </w:r>
           </w:p>
@@ -10529,6 +11453,50 @@
                 <w:szCs w:val="16"/>
                 <w:color w:val="000000"/>
               </w:rPr>
+              <w:t xml:space="preserve">nlme</w:t>
+            </w:r>
+          </w:p>
+        </w:tc>
+        <w:tc>
+          <w:tcPr>
+            <w:tcBorders>
+              <w:bottom w:val="single" w:sz="4" w:space="0" w:color="999999"/>
+              <w:top w:val="none" w:sz="0" w:space="0" w:color="000000"/>
+              <w:left w:val="none" w:sz="0" w:space="0" w:color="000000"/>
+              <w:right w:val="none" w:sz="0" w:space="0" w:color="000000"/>
+            </w:tcBorders>
+            <w:shd w:val="clear" w:color="auto" w:fill="FFFFFF"/>
+            <w:tcMar>
+              <w:top w:w="0" w:type="dxa"/>
+              <w:bottom w:w="0" w:type="dxa"/>
+              <w:left w:w="0" w:type="dxa"/>
+              <w:right w:w="0" w:type="dxa"/>
+            </w:tcMar>
+            <w:vAlign w:val="center"/>
+          </w:tcPr>
+          <w:p>
+            <w:pPr>
+              <w:pStyle w:val="Normal"/>
+              <w:jc w:val="center"/>
+              <w:pBdr>
+                <w:bottom w:val="none" w:sz="0" w:space="0" w:color="000000"/>
+                <w:top w:val="none" w:sz="0" w:space="0" w:color="000000"/>
+                <w:left w:val="none" w:sz="0" w:space="0" w:color="000000"/>
+                <w:right w:val="none" w:sz="0" w:space="0" w:color="000000"/>
+              </w:pBdr>
+              <w:spacing w:after="40" w:before="40" w:line="240"/>
+              <w:ind w:left="40" w:right="40" w:firstLine="0" w:firstLineChars="0"/>
+            </w:pPr>
+            <w:r>
+              <w:rPr>
+                <w:rFonts w:ascii="Calibri" w:hAnsi="Calibri" w:eastAsia="Calibri" w:cs="Calibri"/>
+                <w:i w:val="false"/>
+                <w:b w:val="false"/>
+                <w:u w:val="none"/>
+                <w:sz w:val="16"/>
+                <w:szCs w:val="16"/>
+                <w:color w:val="000000"/>
+              </w:rPr>
               <w:t xml:space="preserve">23.2</w:t>
             </w:r>
           </w:p>
@@ -11019,6 +11987,50 @@
                 <w:szCs w:val="16"/>
                 <w:color w:val="000000"/>
               </w:rPr>
+              <w:t xml:space="preserve">lme</w:t>
+            </w:r>
+          </w:p>
+        </w:tc>
+        <w:tc>
+          <w:tcPr>
+            <w:tcBorders>
+              <w:bottom w:val="none" w:sz="0" w:space="0" w:color="000000"/>
+              <w:top w:val="single" w:sz="4" w:space="0" w:color="999999"/>
+              <w:left w:val="none" w:sz="0" w:space="0" w:color="000000"/>
+              <w:right w:val="none" w:sz="0" w:space="0" w:color="000000"/>
+            </w:tcBorders>
+            <w:shd w:val="clear" w:color="auto" w:fill="FFFFFF"/>
+            <w:tcMar>
+              <w:top w:w="0" w:type="dxa"/>
+              <w:bottom w:w="0" w:type="dxa"/>
+              <w:left w:w="0" w:type="dxa"/>
+              <w:right w:w="0" w:type="dxa"/>
+            </w:tcMar>
+            <w:vAlign w:val="center"/>
+          </w:tcPr>
+          <w:p>
+            <w:pPr>
+              <w:pStyle w:val="Normal"/>
+              <w:jc w:val="center"/>
+              <w:pBdr>
+                <w:bottom w:val="none" w:sz="0" w:space="0" w:color="000000"/>
+                <w:top w:val="none" w:sz="0" w:space="0" w:color="000000"/>
+                <w:left w:val="none" w:sz="0" w:space="0" w:color="000000"/>
+                <w:right w:val="none" w:sz="0" w:space="0" w:color="000000"/>
+              </w:pBdr>
+              <w:spacing w:after="40" w:before="40" w:line="240"/>
+              <w:ind w:left="40" w:right="40" w:firstLine="0" w:firstLineChars="0"/>
+            </w:pPr>
+            <w:r>
+              <w:rPr>
+                <w:rFonts w:ascii="Calibri" w:hAnsi="Calibri" w:eastAsia="Calibri" w:cs="Calibri"/>
+                <w:i w:val="false"/>
+                <w:b w:val="false"/>
+                <w:u w:val="none"/>
+                <w:sz w:val="16"/>
+                <w:szCs w:val="16"/>
+                <w:color w:val="000000"/>
+              </w:rPr>
               <w:t xml:space="preserve">36.5</w:t>
             </w:r>
           </w:p>
@@ -11509,6 +12521,50 @@
                 <w:szCs w:val="16"/>
                 <w:color w:val="000000"/>
               </w:rPr>
+              <w:t xml:space="preserve">nlme</w:t>
+            </w:r>
+          </w:p>
+        </w:tc>
+        <w:tc>
+          <w:tcPr>
+            <w:tcBorders>
+              <w:bottom w:val="none" w:sz="0" w:space="0" w:color="000000"/>
+              <w:top w:val="none" w:sz="0" w:space="0" w:color="000000"/>
+              <w:left w:val="none" w:sz="0" w:space="0" w:color="000000"/>
+              <w:right w:val="none" w:sz="0" w:space="0" w:color="000000"/>
+            </w:tcBorders>
+            <w:shd w:val="clear" w:color="auto" w:fill="FFFFFF"/>
+            <w:tcMar>
+              <w:top w:w="0" w:type="dxa"/>
+              <w:bottom w:w="0" w:type="dxa"/>
+              <w:left w:w="0" w:type="dxa"/>
+              <w:right w:w="0" w:type="dxa"/>
+            </w:tcMar>
+            <w:vAlign w:val="center"/>
+          </w:tcPr>
+          <w:p>
+            <w:pPr>
+              <w:pStyle w:val="Normal"/>
+              <w:jc w:val="center"/>
+              <w:pBdr>
+                <w:bottom w:val="none" w:sz="0" w:space="0" w:color="000000"/>
+                <w:top w:val="none" w:sz="0" w:space="0" w:color="000000"/>
+                <w:left w:val="none" w:sz="0" w:space="0" w:color="000000"/>
+                <w:right w:val="none" w:sz="0" w:space="0" w:color="000000"/>
+              </w:pBdr>
+              <w:spacing w:after="40" w:before="40" w:line="240"/>
+              <w:ind w:left="40" w:right="40" w:firstLine="0" w:firstLineChars="0"/>
+            </w:pPr>
+            <w:r>
+              <w:rPr>
+                <w:rFonts w:ascii="Calibri" w:hAnsi="Calibri" w:eastAsia="Calibri" w:cs="Calibri"/>
+                <w:i w:val="false"/>
+                <w:b w:val="false"/>
+                <w:u w:val="none"/>
+                <w:sz w:val="16"/>
+                <w:szCs w:val="16"/>
+                <w:color w:val="000000"/>
+              </w:rPr>
               <w:t xml:space="preserve">33.6</w:t>
             </w:r>
           </w:p>
@@ -11999,6 +13055,50 @@
                 <w:szCs w:val="16"/>
                 <w:color w:val="000000"/>
               </w:rPr>
+              <w:t xml:space="preserve">nlme</w:t>
+            </w:r>
+          </w:p>
+        </w:tc>
+        <w:tc>
+          <w:tcPr>
+            <w:tcBorders>
+              <w:bottom w:val="single" w:sz="4" w:space="0" w:color="999999"/>
+              <w:top w:val="none" w:sz="0" w:space="0" w:color="000000"/>
+              <w:left w:val="none" w:sz="0" w:space="0" w:color="000000"/>
+              <w:right w:val="none" w:sz="0" w:space="0" w:color="000000"/>
+            </w:tcBorders>
+            <w:shd w:val="clear" w:color="auto" w:fill="FFFFFF"/>
+            <w:tcMar>
+              <w:top w:w="0" w:type="dxa"/>
+              <w:bottom w:w="0" w:type="dxa"/>
+              <w:left w:w="0" w:type="dxa"/>
+              <w:right w:w="0" w:type="dxa"/>
+            </w:tcMar>
+            <w:vAlign w:val="center"/>
+          </w:tcPr>
+          <w:p>
+            <w:pPr>
+              <w:pStyle w:val="Normal"/>
+              <w:jc w:val="center"/>
+              <w:pBdr>
+                <w:bottom w:val="none" w:sz="0" w:space="0" w:color="000000"/>
+                <w:top w:val="none" w:sz="0" w:space="0" w:color="000000"/>
+                <w:left w:val="none" w:sz="0" w:space="0" w:color="000000"/>
+                <w:right w:val="none" w:sz="0" w:space="0" w:color="000000"/>
+              </w:pBdr>
+              <w:spacing w:after="40" w:before="40" w:line="240"/>
+              <w:ind w:left="40" w:right="40" w:firstLine="0" w:firstLineChars="0"/>
+            </w:pPr>
+            <w:r>
+              <w:rPr>
+                <w:rFonts w:ascii="Calibri" w:hAnsi="Calibri" w:eastAsia="Calibri" w:cs="Calibri"/>
+                <w:i w:val="false"/>
+                <w:b w:val="false"/>
+                <w:u w:val="none"/>
+                <w:sz w:val="16"/>
+                <w:szCs w:val="16"/>
+                <w:color w:val="000000"/>
+              </w:rPr>
               <w:t xml:space="preserve">29.8</w:t>
             </w:r>
           </w:p>
@@ -12489,6 +13589,50 @@
                 <w:szCs w:val="16"/>
                 <w:color w:val="000000"/>
               </w:rPr>
+              <w:t xml:space="preserve">lme</w:t>
+            </w:r>
+          </w:p>
+        </w:tc>
+        <w:tc>
+          <w:tcPr>
+            <w:tcBorders>
+              <w:bottom w:val="none" w:sz="0" w:space="0" w:color="000000"/>
+              <w:top w:val="single" w:sz="4" w:space="0" w:color="999999"/>
+              <w:left w:val="none" w:sz="0" w:space="0" w:color="000000"/>
+              <w:right w:val="none" w:sz="0" w:space="0" w:color="000000"/>
+            </w:tcBorders>
+            <w:shd w:val="clear" w:color="auto" w:fill="FFFFFF"/>
+            <w:tcMar>
+              <w:top w:w="0" w:type="dxa"/>
+              <w:bottom w:w="0" w:type="dxa"/>
+              <w:left w:w="0" w:type="dxa"/>
+              <w:right w:w="0" w:type="dxa"/>
+            </w:tcMar>
+            <w:vAlign w:val="center"/>
+          </w:tcPr>
+          <w:p>
+            <w:pPr>
+              <w:pStyle w:val="Normal"/>
+              <w:jc w:val="center"/>
+              <w:pBdr>
+                <w:bottom w:val="none" w:sz="0" w:space="0" w:color="000000"/>
+                <w:top w:val="none" w:sz="0" w:space="0" w:color="000000"/>
+                <w:left w:val="none" w:sz="0" w:space="0" w:color="000000"/>
+                <w:right w:val="none" w:sz="0" w:space="0" w:color="000000"/>
+              </w:pBdr>
+              <w:spacing w:after="40" w:before="40" w:line="240"/>
+              <w:ind w:left="40" w:right="40" w:firstLine="0" w:firstLineChars="0"/>
+            </w:pPr>
+            <w:r>
+              <w:rPr>
+                <w:rFonts w:ascii="Calibri" w:hAnsi="Calibri" w:eastAsia="Calibri" w:cs="Calibri"/>
+                <w:i w:val="false"/>
+                <w:b w:val="false"/>
+                <w:u w:val="none"/>
+                <w:sz w:val="16"/>
+                <w:szCs w:val="16"/>
+                <w:color w:val="000000"/>
+              </w:rPr>
               <w:t xml:space="preserve">38.5</w:t>
             </w:r>
           </w:p>
@@ -12979,6 +14123,50 @@
                 <w:szCs w:val="16"/>
                 <w:color w:val="000000"/>
               </w:rPr>
+              <w:t xml:space="preserve"/>
+            </w:r>
+          </w:p>
+        </w:tc>
+        <w:tc>
+          <w:tcPr>
+            <w:tcBorders>
+              <w:bottom w:val="none" w:sz="0" w:space="0" w:color="000000"/>
+              <w:top w:val="none" w:sz="0" w:space="0" w:color="000000"/>
+              <w:left w:val="none" w:sz="0" w:space="0" w:color="000000"/>
+              <w:right w:val="none" w:sz="0" w:space="0" w:color="000000"/>
+            </w:tcBorders>
+            <w:shd w:val="clear" w:color="auto" w:fill="FFFFFF"/>
+            <w:tcMar>
+              <w:top w:w="0" w:type="dxa"/>
+              <w:bottom w:w="0" w:type="dxa"/>
+              <w:left w:w="0" w:type="dxa"/>
+              <w:right w:w="0" w:type="dxa"/>
+            </w:tcMar>
+            <w:vAlign w:val="center"/>
+          </w:tcPr>
+          <w:p>
+            <w:pPr>
+              <w:pStyle w:val="Normal"/>
+              <w:jc w:val="center"/>
+              <w:pBdr>
+                <w:bottom w:val="none" w:sz="0" w:space="0" w:color="000000"/>
+                <w:top w:val="none" w:sz="0" w:space="0" w:color="000000"/>
+                <w:left w:val="none" w:sz="0" w:space="0" w:color="000000"/>
+                <w:right w:val="none" w:sz="0" w:space="0" w:color="000000"/>
+              </w:pBdr>
+              <w:spacing w:after="40" w:before="40" w:line="240"/>
+              <w:ind w:left="40" w:right="40" w:firstLine="0" w:firstLineChars="0"/>
+            </w:pPr>
+            <w:r>
+              <w:rPr>
+                <w:rFonts w:ascii="Calibri" w:hAnsi="Calibri" w:eastAsia="Calibri" w:cs="Calibri"/>
+                <w:i w:val="false"/>
+                <w:b w:val="false"/>
+                <w:u w:val="none"/>
+                <w:sz w:val="16"/>
+                <w:szCs w:val="16"/>
+                <w:color w:val="000000"/>
+              </w:rPr>
               <w:t xml:space="preserve">not converged</w:t>
             </w:r>
           </w:p>
@@ -13469,6 +14657,50 @@
                 <w:szCs w:val="16"/>
                 <w:color w:val="000000"/>
               </w:rPr>
+              <w:t xml:space="preserve">nlme</w:t>
+            </w:r>
+          </w:p>
+        </w:tc>
+        <w:tc>
+          <w:tcPr>
+            <w:tcBorders>
+              <w:bottom w:val="single" w:sz="4" w:space="0" w:color="999999"/>
+              <w:top w:val="none" w:sz="0" w:space="0" w:color="000000"/>
+              <w:left w:val="none" w:sz="0" w:space="0" w:color="000000"/>
+              <w:right w:val="none" w:sz="0" w:space="0" w:color="000000"/>
+            </w:tcBorders>
+            <w:shd w:val="clear" w:color="auto" w:fill="FFFFFF"/>
+            <w:tcMar>
+              <w:top w:w="0" w:type="dxa"/>
+              <w:bottom w:w="0" w:type="dxa"/>
+              <w:left w:w="0" w:type="dxa"/>
+              <w:right w:w="0" w:type="dxa"/>
+            </w:tcMar>
+            <w:vAlign w:val="center"/>
+          </w:tcPr>
+          <w:p>
+            <w:pPr>
+              <w:pStyle w:val="Normal"/>
+              <w:jc w:val="center"/>
+              <w:pBdr>
+                <w:bottom w:val="none" w:sz="0" w:space="0" w:color="000000"/>
+                <w:top w:val="none" w:sz="0" w:space="0" w:color="000000"/>
+                <w:left w:val="none" w:sz="0" w:space="0" w:color="000000"/>
+                <w:right w:val="none" w:sz="0" w:space="0" w:color="000000"/>
+              </w:pBdr>
+              <w:spacing w:after="40" w:before="40" w:line="240"/>
+              <w:ind w:left="40" w:right="40" w:firstLine="0" w:firstLineChars="0"/>
+            </w:pPr>
+            <w:r>
+              <w:rPr>
+                <w:rFonts w:ascii="Calibri" w:hAnsi="Calibri" w:eastAsia="Calibri" w:cs="Calibri"/>
+                <w:i w:val="false"/>
+                <w:b w:val="false"/>
+                <w:u w:val="none"/>
+                <w:sz w:val="16"/>
+                <w:szCs w:val="16"/>
+                <w:color w:val="000000"/>
+              </w:rPr>
               <w:t xml:space="preserve">36.1</w:t>
             </w:r>
           </w:p>
@@ -13959,6 +15191,50 @@
                 <w:szCs w:val="16"/>
                 <w:color w:val="000000"/>
               </w:rPr>
+              <w:t xml:space="preserve">lme</w:t>
+            </w:r>
+          </w:p>
+        </w:tc>
+        <w:tc>
+          <w:tcPr>
+            <w:tcBorders>
+              <w:bottom w:val="none" w:sz="0" w:space="0" w:color="000000"/>
+              <w:top w:val="single" w:sz="4" w:space="0" w:color="999999"/>
+              <w:left w:val="none" w:sz="0" w:space="0" w:color="000000"/>
+              <w:right w:val="none" w:sz="0" w:space="0" w:color="000000"/>
+            </w:tcBorders>
+            <w:shd w:val="clear" w:color="auto" w:fill="FFFFFF"/>
+            <w:tcMar>
+              <w:top w:w="0" w:type="dxa"/>
+              <w:bottom w:w="0" w:type="dxa"/>
+              <w:left w:w="0" w:type="dxa"/>
+              <w:right w:w="0" w:type="dxa"/>
+            </w:tcMar>
+            <w:vAlign w:val="center"/>
+          </w:tcPr>
+          <w:p>
+            <w:pPr>
+              <w:pStyle w:val="Normal"/>
+              <w:jc w:val="center"/>
+              <w:pBdr>
+                <w:bottom w:val="none" w:sz="0" w:space="0" w:color="000000"/>
+                <w:top w:val="none" w:sz="0" w:space="0" w:color="000000"/>
+                <w:left w:val="none" w:sz="0" w:space="0" w:color="000000"/>
+                <w:right w:val="none" w:sz="0" w:space="0" w:color="000000"/>
+              </w:pBdr>
+              <w:spacing w:after="40" w:before="40" w:line="240"/>
+              <w:ind w:left="40" w:right="40" w:firstLine="0" w:firstLineChars="0"/>
+            </w:pPr>
+            <w:r>
+              <w:rPr>
+                <w:rFonts w:ascii="Calibri" w:hAnsi="Calibri" w:eastAsia="Calibri" w:cs="Calibri"/>
+                <w:i w:val="false"/>
+                <w:b w:val="false"/>
+                <w:u w:val="none"/>
+                <w:sz w:val="16"/>
+                <w:szCs w:val="16"/>
+                <w:color w:val="000000"/>
+              </w:rPr>
               <w:t xml:space="preserve">27.1</w:t>
             </w:r>
           </w:p>
@@ -14449,6 +15725,50 @@
                 <w:szCs w:val="16"/>
                 <w:color w:val="000000"/>
               </w:rPr>
+              <w:t xml:space="preserve">nlme</w:t>
+            </w:r>
+          </w:p>
+        </w:tc>
+        <w:tc>
+          <w:tcPr>
+            <w:tcBorders>
+              <w:bottom w:val="none" w:sz="0" w:space="0" w:color="000000"/>
+              <w:top w:val="none" w:sz="0" w:space="0" w:color="000000"/>
+              <w:left w:val="none" w:sz="0" w:space="0" w:color="000000"/>
+              <w:right w:val="none" w:sz="0" w:space="0" w:color="000000"/>
+            </w:tcBorders>
+            <w:shd w:val="clear" w:color="auto" w:fill="FFFFFF"/>
+            <w:tcMar>
+              <w:top w:w="0" w:type="dxa"/>
+              <w:bottom w:w="0" w:type="dxa"/>
+              <w:left w:w="0" w:type="dxa"/>
+              <w:right w:w="0" w:type="dxa"/>
+            </w:tcMar>
+            <w:vAlign w:val="center"/>
+          </w:tcPr>
+          <w:p>
+            <w:pPr>
+              <w:pStyle w:val="Normal"/>
+              <w:jc w:val="center"/>
+              <w:pBdr>
+                <w:bottom w:val="none" w:sz="0" w:space="0" w:color="000000"/>
+                <w:top w:val="none" w:sz="0" w:space="0" w:color="000000"/>
+                <w:left w:val="none" w:sz="0" w:space="0" w:color="000000"/>
+                <w:right w:val="none" w:sz="0" w:space="0" w:color="000000"/>
+              </w:pBdr>
+              <w:spacing w:after="40" w:before="40" w:line="240"/>
+              <w:ind w:left="40" w:right="40" w:firstLine="0" w:firstLineChars="0"/>
+            </w:pPr>
+            <w:r>
+              <w:rPr>
+                <w:rFonts w:ascii="Calibri" w:hAnsi="Calibri" w:eastAsia="Calibri" w:cs="Calibri"/>
+                <w:i w:val="false"/>
+                <w:b w:val="false"/>
+                <w:u w:val="none"/>
+                <w:sz w:val="16"/>
+                <w:szCs w:val="16"/>
+                <w:color w:val="000000"/>
+              </w:rPr>
               <w:t xml:space="preserve">12.9</w:t>
             </w:r>
           </w:p>
@@ -14939,6 +16259,50 @@
                 <w:szCs w:val="16"/>
                 <w:color w:val="000000"/>
               </w:rPr>
+              <w:t xml:space="preserve">nlme</w:t>
+            </w:r>
+          </w:p>
+        </w:tc>
+        <w:tc>
+          <w:tcPr>
+            <w:tcBorders>
+              <w:bottom w:val="single" w:sz="4" w:space="0" w:color="999999"/>
+              <w:top w:val="none" w:sz="0" w:space="0" w:color="000000"/>
+              <w:left w:val="none" w:sz="0" w:space="0" w:color="000000"/>
+              <w:right w:val="none" w:sz="0" w:space="0" w:color="000000"/>
+            </w:tcBorders>
+            <w:shd w:val="clear" w:color="auto" w:fill="FFFFFF"/>
+            <w:tcMar>
+              <w:top w:w="0" w:type="dxa"/>
+              <w:bottom w:w="0" w:type="dxa"/>
+              <w:left w:w="0" w:type="dxa"/>
+              <w:right w:w="0" w:type="dxa"/>
+            </w:tcMar>
+            <w:vAlign w:val="center"/>
+          </w:tcPr>
+          <w:p>
+            <w:pPr>
+              <w:pStyle w:val="Normal"/>
+              <w:jc w:val="center"/>
+              <w:pBdr>
+                <w:bottom w:val="none" w:sz="0" w:space="0" w:color="000000"/>
+                <w:top w:val="none" w:sz="0" w:space="0" w:color="000000"/>
+                <w:left w:val="none" w:sz="0" w:space="0" w:color="000000"/>
+                <w:right w:val="none" w:sz="0" w:space="0" w:color="000000"/>
+              </w:pBdr>
+              <w:spacing w:after="40" w:before="40" w:line="240"/>
+              <w:ind w:left="40" w:right="40" w:firstLine="0" w:firstLineChars="0"/>
+            </w:pPr>
+            <w:r>
+              <w:rPr>
+                <w:rFonts w:ascii="Calibri" w:hAnsi="Calibri" w:eastAsia="Calibri" w:cs="Calibri"/>
+                <w:i w:val="false"/>
+                <w:b w:val="false"/>
+                <w:u w:val="none"/>
+                <w:sz w:val="16"/>
+                <w:szCs w:val="16"/>
+                <w:color w:val="000000"/>
+              </w:rPr>
               <w:t xml:space="preserve">19.4</w:t>
             </w:r>
           </w:p>
@@ -15429,6 +16793,50 @@
                 <w:szCs w:val="16"/>
                 <w:color w:val="000000"/>
               </w:rPr>
+              <w:t xml:space="preserve">lme</w:t>
+            </w:r>
+          </w:p>
+        </w:tc>
+        <w:tc>
+          <w:tcPr>
+            <w:tcBorders>
+              <w:bottom w:val="none" w:sz="0" w:space="0" w:color="000000"/>
+              <w:top w:val="single" w:sz="4" w:space="0" w:color="999999"/>
+              <w:left w:val="none" w:sz="0" w:space="0" w:color="000000"/>
+              <w:right w:val="none" w:sz="0" w:space="0" w:color="000000"/>
+            </w:tcBorders>
+            <w:shd w:val="clear" w:color="auto" w:fill="FFFFFF"/>
+            <w:tcMar>
+              <w:top w:w="0" w:type="dxa"/>
+              <w:bottom w:w="0" w:type="dxa"/>
+              <w:left w:w="0" w:type="dxa"/>
+              <w:right w:w="0" w:type="dxa"/>
+            </w:tcMar>
+            <w:vAlign w:val="center"/>
+          </w:tcPr>
+          <w:p>
+            <w:pPr>
+              <w:pStyle w:val="Normal"/>
+              <w:jc w:val="center"/>
+              <w:pBdr>
+                <w:bottom w:val="none" w:sz="0" w:space="0" w:color="000000"/>
+                <w:top w:val="none" w:sz="0" w:space="0" w:color="000000"/>
+                <w:left w:val="none" w:sz="0" w:space="0" w:color="000000"/>
+                <w:right w:val="none" w:sz="0" w:space="0" w:color="000000"/>
+              </w:pBdr>
+              <w:spacing w:after="40" w:before="40" w:line="240"/>
+              <w:ind w:left="40" w:right="40" w:firstLine="0" w:firstLineChars="0"/>
+            </w:pPr>
+            <w:r>
+              <w:rPr>
+                <w:rFonts w:ascii="Calibri" w:hAnsi="Calibri" w:eastAsia="Calibri" w:cs="Calibri"/>
+                <w:i w:val="false"/>
+                <w:b w:val="false"/>
+                <w:u w:val="none"/>
+                <w:sz w:val="16"/>
+                <w:szCs w:val="16"/>
+                <w:color w:val="000000"/>
+              </w:rPr>
               <w:t xml:space="preserve">32.3</w:t>
             </w:r>
           </w:p>
@@ -15919,6 +17327,50 @@
                 <w:szCs w:val="16"/>
                 <w:color w:val="000000"/>
               </w:rPr>
+              <w:t xml:space="preserve"/>
+            </w:r>
+          </w:p>
+        </w:tc>
+        <w:tc>
+          <w:tcPr>
+            <w:tcBorders>
+              <w:bottom w:val="none" w:sz="0" w:space="0" w:color="000000"/>
+              <w:top w:val="none" w:sz="0" w:space="0" w:color="000000"/>
+              <w:left w:val="none" w:sz="0" w:space="0" w:color="000000"/>
+              <w:right w:val="none" w:sz="0" w:space="0" w:color="000000"/>
+            </w:tcBorders>
+            <w:shd w:val="clear" w:color="auto" w:fill="FFFFFF"/>
+            <w:tcMar>
+              <w:top w:w="0" w:type="dxa"/>
+              <w:bottom w:w="0" w:type="dxa"/>
+              <w:left w:w="0" w:type="dxa"/>
+              <w:right w:w="0" w:type="dxa"/>
+            </w:tcMar>
+            <w:vAlign w:val="center"/>
+          </w:tcPr>
+          <w:p>
+            <w:pPr>
+              <w:pStyle w:val="Normal"/>
+              <w:jc w:val="center"/>
+              <w:pBdr>
+                <w:bottom w:val="none" w:sz="0" w:space="0" w:color="000000"/>
+                <w:top w:val="none" w:sz="0" w:space="0" w:color="000000"/>
+                <w:left w:val="none" w:sz="0" w:space="0" w:color="000000"/>
+                <w:right w:val="none" w:sz="0" w:space="0" w:color="000000"/>
+              </w:pBdr>
+              <w:spacing w:after="40" w:before="40" w:line="240"/>
+              <w:ind w:left="40" w:right="40" w:firstLine="0" w:firstLineChars="0"/>
+            </w:pPr>
+            <w:r>
+              <w:rPr>
+                <w:rFonts w:ascii="Calibri" w:hAnsi="Calibri" w:eastAsia="Calibri" w:cs="Calibri"/>
+                <w:i w:val="false"/>
+                <w:b w:val="false"/>
+                <w:u w:val="none"/>
+                <w:sz w:val="16"/>
+                <w:szCs w:val="16"/>
+                <w:color w:val="000000"/>
+              </w:rPr>
               <w:t xml:space="preserve">not converged</w:t>
             </w:r>
           </w:p>
@@ -16409,6 +17861,50 @@
                 <w:szCs w:val="16"/>
                 <w:color w:val="000000"/>
               </w:rPr>
+              <w:t xml:space="preserve">nlme</w:t>
+            </w:r>
+          </w:p>
+        </w:tc>
+        <w:tc>
+          <w:tcPr>
+            <w:tcBorders>
+              <w:bottom w:val="single" w:sz="4" w:space="0" w:color="999999"/>
+              <w:top w:val="none" w:sz="0" w:space="0" w:color="000000"/>
+              <w:left w:val="none" w:sz="0" w:space="0" w:color="000000"/>
+              <w:right w:val="none" w:sz="0" w:space="0" w:color="000000"/>
+            </w:tcBorders>
+            <w:shd w:val="clear" w:color="auto" w:fill="FFFFFF"/>
+            <w:tcMar>
+              <w:top w:w="0" w:type="dxa"/>
+              <w:bottom w:w="0" w:type="dxa"/>
+              <w:left w:w="0" w:type="dxa"/>
+              <w:right w:w="0" w:type="dxa"/>
+            </w:tcMar>
+            <w:vAlign w:val="center"/>
+          </w:tcPr>
+          <w:p>
+            <w:pPr>
+              <w:pStyle w:val="Normal"/>
+              <w:jc w:val="center"/>
+              <w:pBdr>
+                <w:bottom w:val="none" w:sz="0" w:space="0" w:color="000000"/>
+                <w:top w:val="none" w:sz="0" w:space="0" w:color="000000"/>
+                <w:left w:val="none" w:sz="0" w:space="0" w:color="000000"/>
+                <w:right w:val="none" w:sz="0" w:space="0" w:color="000000"/>
+              </w:pBdr>
+              <w:spacing w:after="40" w:before="40" w:line="240"/>
+              <w:ind w:left="40" w:right="40" w:firstLine="0" w:firstLineChars="0"/>
+            </w:pPr>
+            <w:r>
+              <w:rPr>
+                <w:rFonts w:ascii="Calibri" w:hAnsi="Calibri" w:eastAsia="Calibri" w:cs="Calibri"/>
+                <w:i w:val="false"/>
+                <w:b w:val="false"/>
+                <w:u w:val="none"/>
+                <w:sz w:val="16"/>
+                <w:szCs w:val="16"/>
+                <w:color w:val="000000"/>
+              </w:rPr>
               <w:t xml:space="preserve">30.5</w:t>
             </w:r>
           </w:p>
@@ -16899,6 +18395,50 @@
                 <w:szCs w:val="16"/>
                 <w:color w:val="000000"/>
               </w:rPr>
+              <w:t xml:space="preserve">lme</w:t>
+            </w:r>
+          </w:p>
+        </w:tc>
+        <w:tc>
+          <w:tcPr>
+            <w:tcBorders>
+              <w:bottom w:val="none" w:sz="0" w:space="0" w:color="000000"/>
+              <w:top w:val="single" w:sz="4" w:space="0" w:color="999999"/>
+              <w:left w:val="none" w:sz="0" w:space="0" w:color="000000"/>
+              <w:right w:val="none" w:sz="0" w:space="0" w:color="000000"/>
+            </w:tcBorders>
+            <w:shd w:val="clear" w:color="auto" w:fill="FFFFFF"/>
+            <w:tcMar>
+              <w:top w:w="0" w:type="dxa"/>
+              <w:bottom w:w="0" w:type="dxa"/>
+              <w:left w:w="0" w:type="dxa"/>
+              <w:right w:w="0" w:type="dxa"/>
+            </w:tcMar>
+            <w:vAlign w:val="center"/>
+          </w:tcPr>
+          <w:p>
+            <w:pPr>
+              <w:pStyle w:val="Normal"/>
+              <w:jc w:val="center"/>
+              <w:pBdr>
+                <w:bottom w:val="none" w:sz="0" w:space="0" w:color="000000"/>
+                <w:top w:val="none" w:sz="0" w:space="0" w:color="000000"/>
+                <w:left w:val="none" w:sz="0" w:space="0" w:color="000000"/>
+                <w:right w:val="none" w:sz="0" w:space="0" w:color="000000"/>
+              </w:pBdr>
+              <w:spacing w:after="40" w:before="40" w:line="240"/>
+              <w:ind w:left="40" w:right="40" w:firstLine="0" w:firstLineChars="0"/>
+            </w:pPr>
+            <w:r>
+              <w:rPr>
+                <w:rFonts w:ascii="Calibri" w:hAnsi="Calibri" w:eastAsia="Calibri" w:cs="Calibri"/>
+                <w:i w:val="false"/>
+                <w:b w:val="false"/>
+                <w:u w:val="none"/>
+                <w:sz w:val="16"/>
+                <w:szCs w:val="16"/>
+                <w:color w:val="000000"/>
+              </w:rPr>
               <w:t xml:space="preserve">33.1</w:t>
             </w:r>
           </w:p>
@@ -17389,6 +18929,50 @@
                 <w:szCs w:val="16"/>
                 <w:color w:val="000000"/>
               </w:rPr>
+              <w:t xml:space="preserve">nlme</w:t>
+            </w:r>
+          </w:p>
+        </w:tc>
+        <w:tc>
+          <w:tcPr>
+            <w:tcBorders>
+              <w:bottom w:val="none" w:sz="0" w:space="0" w:color="000000"/>
+              <w:top w:val="none" w:sz="0" w:space="0" w:color="000000"/>
+              <w:left w:val="none" w:sz="0" w:space="0" w:color="000000"/>
+              <w:right w:val="none" w:sz="0" w:space="0" w:color="000000"/>
+            </w:tcBorders>
+            <w:shd w:val="clear" w:color="auto" w:fill="FFFFFF"/>
+            <w:tcMar>
+              <w:top w:w="0" w:type="dxa"/>
+              <w:bottom w:w="0" w:type="dxa"/>
+              <w:left w:w="0" w:type="dxa"/>
+              <w:right w:w="0" w:type="dxa"/>
+            </w:tcMar>
+            <w:vAlign w:val="center"/>
+          </w:tcPr>
+          <w:p>
+            <w:pPr>
+              <w:pStyle w:val="Normal"/>
+              <w:jc w:val="center"/>
+              <w:pBdr>
+                <w:bottom w:val="none" w:sz="0" w:space="0" w:color="000000"/>
+                <w:top w:val="none" w:sz="0" w:space="0" w:color="000000"/>
+                <w:left w:val="none" w:sz="0" w:space="0" w:color="000000"/>
+                <w:right w:val="none" w:sz="0" w:space="0" w:color="000000"/>
+              </w:pBdr>
+              <w:spacing w:after="40" w:before="40" w:line="240"/>
+              <w:ind w:left="40" w:right="40" w:firstLine="0" w:firstLineChars="0"/>
+            </w:pPr>
+            <w:r>
+              <w:rPr>
+                <w:rFonts w:ascii="Calibri" w:hAnsi="Calibri" w:eastAsia="Calibri" w:cs="Calibri"/>
+                <w:i w:val="false"/>
+                <w:b w:val="false"/>
+                <w:u w:val="none"/>
+                <w:sz w:val="16"/>
+                <w:szCs w:val="16"/>
+                <w:color w:val="000000"/>
+              </w:rPr>
               <w:t xml:space="preserve">16.9</w:t>
             </w:r>
           </w:p>
@@ -17879,6 +19463,50 @@
                 <w:szCs w:val="16"/>
                 <w:color w:val="000000"/>
               </w:rPr>
+              <w:t xml:space="preserve">nlme</w:t>
+            </w:r>
+          </w:p>
+        </w:tc>
+        <w:tc>
+          <w:tcPr>
+            <w:tcBorders>
+              <w:bottom w:val="single" w:sz="4" w:space="0" w:color="999999"/>
+              <w:top w:val="none" w:sz="0" w:space="0" w:color="000000"/>
+              <w:left w:val="none" w:sz="0" w:space="0" w:color="000000"/>
+              <w:right w:val="none" w:sz="0" w:space="0" w:color="000000"/>
+            </w:tcBorders>
+            <w:shd w:val="clear" w:color="auto" w:fill="FFFFFF"/>
+            <w:tcMar>
+              <w:top w:w="0" w:type="dxa"/>
+              <w:bottom w:w="0" w:type="dxa"/>
+              <w:left w:w="0" w:type="dxa"/>
+              <w:right w:w="0" w:type="dxa"/>
+            </w:tcMar>
+            <w:vAlign w:val="center"/>
+          </w:tcPr>
+          <w:p>
+            <w:pPr>
+              <w:pStyle w:val="Normal"/>
+              <w:jc w:val="center"/>
+              <w:pBdr>
+                <w:bottom w:val="none" w:sz="0" w:space="0" w:color="000000"/>
+                <w:top w:val="none" w:sz="0" w:space="0" w:color="000000"/>
+                <w:left w:val="none" w:sz="0" w:space="0" w:color="000000"/>
+                <w:right w:val="none" w:sz="0" w:space="0" w:color="000000"/>
+              </w:pBdr>
+              <w:spacing w:after="40" w:before="40" w:line="240"/>
+              <w:ind w:left="40" w:right="40" w:firstLine="0" w:firstLineChars="0"/>
+            </w:pPr>
+            <w:r>
+              <w:rPr>
+                <w:rFonts w:ascii="Calibri" w:hAnsi="Calibri" w:eastAsia="Calibri" w:cs="Calibri"/>
+                <w:i w:val="false"/>
+                <w:b w:val="false"/>
+                <w:u w:val="none"/>
+                <w:sz w:val="16"/>
+                <w:szCs w:val="16"/>
+                <w:color w:val="000000"/>
+              </w:rPr>
               <w:t xml:space="preserve">21.3</w:t>
             </w:r>
           </w:p>
@@ -18369,6 +19997,50 @@
                 <w:szCs w:val="16"/>
                 <w:color w:val="000000"/>
               </w:rPr>
+              <w:t xml:space="preserve">lme</w:t>
+            </w:r>
+          </w:p>
+        </w:tc>
+        <w:tc>
+          <w:tcPr>
+            <w:tcBorders>
+              <w:bottom w:val="none" w:sz="0" w:space="0" w:color="000000"/>
+              <w:top w:val="single" w:sz="4" w:space="0" w:color="999999"/>
+              <w:left w:val="none" w:sz="0" w:space="0" w:color="000000"/>
+              <w:right w:val="none" w:sz="0" w:space="0" w:color="000000"/>
+            </w:tcBorders>
+            <w:shd w:val="clear" w:color="auto" w:fill="FFFFFF"/>
+            <w:tcMar>
+              <w:top w:w="0" w:type="dxa"/>
+              <w:bottom w:w="0" w:type="dxa"/>
+              <w:left w:w="0" w:type="dxa"/>
+              <w:right w:w="0" w:type="dxa"/>
+            </w:tcMar>
+            <w:vAlign w:val="center"/>
+          </w:tcPr>
+          <w:p>
+            <w:pPr>
+              <w:pStyle w:val="Normal"/>
+              <w:jc w:val="center"/>
+              <w:pBdr>
+                <w:bottom w:val="none" w:sz="0" w:space="0" w:color="000000"/>
+                <w:top w:val="none" w:sz="0" w:space="0" w:color="000000"/>
+                <w:left w:val="none" w:sz="0" w:space="0" w:color="000000"/>
+                <w:right w:val="none" w:sz="0" w:space="0" w:color="000000"/>
+              </w:pBdr>
+              <w:spacing w:after="40" w:before="40" w:line="240"/>
+              <w:ind w:left="40" w:right="40" w:firstLine="0" w:firstLineChars="0"/>
+            </w:pPr>
+            <w:r>
+              <w:rPr>
+                <w:rFonts w:ascii="Calibri" w:hAnsi="Calibri" w:eastAsia="Calibri" w:cs="Calibri"/>
+                <w:i w:val="false"/>
+                <w:b w:val="false"/>
+                <w:u w:val="none"/>
+                <w:sz w:val="16"/>
+                <w:szCs w:val="16"/>
+                <w:color w:val="000000"/>
+              </w:rPr>
               <w:t xml:space="preserve">35.3</w:t>
             </w:r>
           </w:p>
@@ -18859,6 +20531,50 @@
                 <w:szCs w:val="16"/>
                 <w:color w:val="000000"/>
               </w:rPr>
+              <w:t xml:space="preserve">nlme</w:t>
+            </w:r>
+          </w:p>
+        </w:tc>
+        <w:tc>
+          <w:tcPr>
+            <w:tcBorders>
+              <w:bottom w:val="none" w:sz="0" w:space="0" w:color="000000"/>
+              <w:top w:val="none" w:sz="0" w:space="0" w:color="000000"/>
+              <w:left w:val="none" w:sz="0" w:space="0" w:color="000000"/>
+              <w:right w:val="none" w:sz="0" w:space="0" w:color="000000"/>
+            </w:tcBorders>
+            <w:shd w:val="clear" w:color="auto" w:fill="FFFFFF"/>
+            <w:tcMar>
+              <w:top w:w="0" w:type="dxa"/>
+              <w:bottom w:w="0" w:type="dxa"/>
+              <w:left w:w="0" w:type="dxa"/>
+              <w:right w:w="0" w:type="dxa"/>
+            </w:tcMar>
+            <w:vAlign w:val="center"/>
+          </w:tcPr>
+          <w:p>
+            <w:pPr>
+              <w:pStyle w:val="Normal"/>
+              <w:jc w:val="center"/>
+              <w:pBdr>
+                <w:bottom w:val="none" w:sz="0" w:space="0" w:color="000000"/>
+                <w:top w:val="none" w:sz="0" w:space="0" w:color="000000"/>
+                <w:left w:val="none" w:sz="0" w:space="0" w:color="000000"/>
+                <w:right w:val="none" w:sz="0" w:space="0" w:color="000000"/>
+              </w:pBdr>
+              <w:spacing w:after="40" w:before="40" w:line="240"/>
+              <w:ind w:left="40" w:right="40" w:firstLine="0" w:firstLineChars="0"/>
+            </w:pPr>
+            <w:r>
+              <w:rPr>
+                <w:rFonts w:ascii="Calibri" w:hAnsi="Calibri" w:eastAsia="Calibri" w:cs="Calibri"/>
+                <w:i w:val="false"/>
+                <w:b w:val="false"/>
+                <w:u w:val="none"/>
+                <w:sz w:val="16"/>
+                <w:szCs w:val="16"/>
+                <w:color w:val="000000"/>
+              </w:rPr>
               <w:t xml:space="preserve">30.1</w:t>
             </w:r>
           </w:p>
@@ -19349,6 +21065,50 @@
                 <w:szCs w:val="16"/>
                 <w:color w:val="000000"/>
               </w:rPr>
+              <w:t xml:space="preserve">nlme</w:t>
+            </w:r>
+          </w:p>
+        </w:tc>
+        <w:tc>
+          <w:tcPr>
+            <w:tcBorders>
+              <w:bottom w:val="single" w:sz="4" w:space="0" w:color="999999"/>
+              <w:top w:val="none" w:sz="0" w:space="0" w:color="000000"/>
+              <w:left w:val="none" w:sz="0" w:space="0" w:color="000000"/>
+              <w:right w:val="none" w:sz="0" w:space="0" w:color="000000"/>
+            </w:tcBorders>
+            <w:shd w:val="clear" w:color="auto" w:fill="FFFFFF"/>
+            <w:tcMar>
+              <w:top w:w="0" w:type="dxa"/>
+              <w:bottom w:w="0" w:type="dxa"/>
+              <w:left w:w="0" w:type="dxa"/>
+              <w:right w:w="0" w:type="dxa"/>
+            </w:tcMar>
+            <w:vAlign w:val="center"/>
+          </w:tcPr>
+          <w:p>
+            <w:pPr>
+              <w:pStyle w:val="Normal"/>
+              <w:jc w:val="center"/>
+              <w:pBdr>
+                <w:bottom w:val="none" w:sz="0" w:space="0" w:color="000000"/>
+                <w:top w:val="none" w:sz="0" w:space="0" w:color="000000"/>
+                <w:left w:val="none" w:sz="0" w:space="0" w:color="000000"/>
+                <w:right w:val="none" w:sz="0" w:space="0" w:color="000000"/>
+              </w:pBdr>
+              <w:spacing w:after="40" w:before="40" w:line="240"/>
+              <w:ind w:left="40" w:right="40" w:firstLine="0" w:firstLineChars="0"/>
+            </w:pPr>
+            <w:r>
+              <w:rPr>
+                <w:rFonts w:ascii="Calibri" w:hAnsi="Calibri" w:eastAsia="Calibri" w:cs="Calibri"/>
+                <w:i w:val="false"/>
+                <w:b w:val="false"/>
+                <w:u w:val="none"/>
+                <w:sz w:val="16"/>
+                <w:szCs w:val="16"/>
+                <w:color w:val="000000"/>
+              </w:rPr>
               <w:t xml:space="preserve">30.1</w:t>
             </w:r>
           </w:p>
@@ -19839,6 +21599,50 @@
                 <w:szCs w:val="16"/>
                 <w:color w:val="000000"/>
               </w:rPr>
+              <w:t xml:space="preserve">lme</w:t>
+            </w:r>
+          </w:p>
+        </w:tc>
+        <w:tc>
+          <w:tcPr>
+            <w:tcBorders>
+              <w:bottom w:val="none" w:sz="0" w:space="0" w:color="000000"/>
+              <w:top w:val="single" w:sz="4" w:space="0" w:color="999999"/>
+              <w:left w:val="none" w:sz="0" w:space="0" w:color="000000"/>
+              <w:right w:val="none" w:sz="0" w:space="0" w:color="000000"/>
+            </w:tcBorders>
+            <w:shd w:val="clear" w:color="auto" w:fill="FFFFFF"/>
+            <w:tcMar>
+              <w:top w:w="0" w:type="dxa"/>
+              <w:bottom w:w="0" w:type="dxa"/>
+              <w:left w:w="0" w:type="dxa"/>
+              <w:right w:w="0" w:type="dxa"/>
+            </w:tcMar>
+            <w:vAlign w:val="center"/>
+          </w:tcPr>
+          <w:p>
+            <w:pPr>
+              <w:pStyle w:val="Normal"/>
+              <w:jc w:val="center"/>
+              <w:pBdr>
+                <w:bottom w:val="none" w:sz="0" w:space="0" w:color="000000"/>
+                <w:top w:val="none" w:sz="0" w:space="0" w:color="000000"/>
+                <w:left w:val="none" w:sz="0" w:space="0" w:color="000000"/>
+                <w:right w:val="none" w:sz="0" w:space="0" w:color="000000"/>
+              </w:pBdr>
+              <w:spacing w:after="40" w:before="40" w:line="240"/>
+              <w:ind w:left="40" w:right="40" w:firstLine="0" w:firstLineChars="0"/>
+            </w:pPr>
+            <w:r>
+              <w:rPr>
+                <w:rFonts w:ascii="Calibri" w:hAnsi="Calibri" w:eastAsia="Calibri" w:cs="Calibri"/>
+                <w:i w:val="false"/>
+                <w:b w:val="false"/>
+                <w:u w:val="none"/>
+                <w:sz w:val="16"/>
+                <w:szCs w:val="16"/>
+                <w:color w:val="000000"/>
+              </w:rPr>
               <w:t xml:space="preserve">38.0</w:t>
             </w:r>
           </w:p>
@@ -20329,6 +22133,50 @@
                 <w:szCs w:val="16"/>
                 <w:color w:val="000000"/>
               </w:rPr>
+              <w:t xml:space="preserve">nls*</w:t>
+            </w:r>
+          </w:p>
+        </w:tc>
+        <w:tc>
+          <w:tcPr>
+            <w:tcBorders>
+              <w:bottom w:val="none" w:sz="0" w:space="0" w:color="000000"/>
+              <w:top w:val="none" w:sz="0" w:space="0" w:color="000000"/>
+              <w:left w:val="none" w:sz="0" w:space="0" w:color="000000"/>
+              <w:right w:val="none" w:sz="0" w:space="0" w:color="000000"/>
+            </w:tcBorders>
+            <w:shd w:val="clear" w:color="auto" w:fill="FFFFFF"/>
+            <w:tcMar>
+              <w:top w:w="0" w:type="dxa"/>
+              <w:bottom w:w="0" w:type="dxa"/>
+              <w:left w:w="0" w:type="dxa"/>
+              <w:right w:w="0" w:type="dxa"/>
+            </w:tcMar>
+            <w:vAlign w:val="center"/>
+          </w:tcPr>
+          <w:p>
+            <w:pPr>
+              <w:pStyle w:val="Normal"/>
+              <w:jc w:val="center"/>
+              <w:pBdr>
+                <w:bottom w:val="none" w:sz="0" w:space="0" w:color="000000"/>
+                <w:top w:val="none" w:sz="0" w:space="0" w:color="000000"/>
+                <w:left w:val="none" w:sz="0" w:space="0" w:color="000000"/>
+                <w:right w:val="none" w:sz="0" w:space="0" w:color="000000"/>
+              </w:pBdr>
+              <w:spacing w:after="40" w:before="40" w:line="240"/>
+              <w:ind w:left="40" w:right="40" w:firstLine="0" w:firstLineChars="0"/>
+            </w:pPr>
+            <w:r>
+              <w:rPr>
+                <w:rFonts w:ascii="Calibri" w:hAnsi="Calibri" w:eastAsia="Calibri" w:cs="Calibri"/>
+                <w:i w:val="false"/>
+                <w:b w:val="false"/>
+                <w:u w:val="none"/>
+                <w:sz w:val="16"/>
+                <w:szCs w:val="16"/>
+                <w:color w:val="000000"/>
+              </w:rPr>
               <w:t xml:space="preserve">35.6</w:t>
             </w:r>
           </w:p>
@@ -20776,6 +22624,50 @@
                 <w:color w:val="000000"/>
               </w:rPr>
               <w:t xml:space="preserve">Linear-plateau</w:t>
+            </w:r>
+          </w:p>
+        </w:tc>
+        <w:tc>
+          <w:tcPr>
+            <w:tcBorders>
+              <w:bottom w:val="single" w:sz="8" w:space="0" w:color="000000"/>
+              <w:top w:val="none" w:sz="0" w:space="0" w:color="000000"/>
+              <w:left w:val="none" w:sz="0" w:space="0" w:color="000000"/>
+              <w:right w:val="none" w:sz="0" w:space="0" w:color="000000"/>
+            </w:tcBorders>
+            <w:shd w:val="clear" w:color="auto" w:fill="FFFFFF"/>
+            <w:tcMar>
+              <w:top w:w="0" w:type="dxa"/>
+              <w:bottom w:w="0" w:type="dxa"/>
+              <w:left w:w="0" w:type="dxa"/>
+              <w:right w:w="0" w:type="dxa"/>
+            </w:tcMar>
+            <w:vAlign w:val="center"/>
+          </w:tcPr>
+          <w:p>
+            <w:pPr>
+              <w:pStyle w:val="Normal"/>
+              <w:jc w:val="center"/>
+              <w:pBdr>
+                <w:bottom w:val="none" w:sz="0" w:space="0" w:color="000000"/>
+                <w:top w:val="none" w:sz="0" w:space="0" w:color="000000"/>
+                <w:left w:val="none" w:sz="0" w:space="0" w:color="000000"/>
+                <w:right w:val="none" w:sz="0" w:space="0" w:color="000000"/>
+              </w:pBdr>
+              <w:spacing w:after="40" w:before="40" w:line="240"/>
+              <w:ind w:left="40" w:right="40" w:firstLine="0" w:firstLineChars="0"/>
+            </w:pPr>
+            <w:r>
+              <w:rPr>
+                <w:rFonts w:ascii="Calibri" w:hAnsi="Calibri" w:eastAsia="Calibri" w:cs="Calibri"/>
+                <w:i w:val="false"/>
+                <w:b w:val="false"/>
+                <w:u w:val="none"/>
+                <w:sz w:val="16"/>
+                <w:szCs w:val="16"/>
+                <w:color w:val="000000"/>
+              </w:rPr>
+              <w:t xml:space="preserve">nlme</w:t>
             </w:r>
           </w:p>
         </w:tc>
@@ -21340,6 +23232,50 @@
                 <w:szCs w:val="16"/>
                 <w:color w:val="000000"/>
               </w:rPr>
+              <w:t xml:space="preserve">Fit</w:t>
+            </w:r>
+          </w:p>
+        </w:tc>
+        <w:tc>
+          <w:tcPr>
+            <w:tcBorders>
+              <w:bottom w:val="single" w:sz="8" w:space="0" w:color="000000"/>
+              <w:top w:val="single" w:sz="8" w:space="0" w:color="000000"/>
+              <w:left w:val="none" w:sz="0" w:space="0" w:color="000000"/>
+              <w:right w:val="none" w:sz="0" w:space="0" w:color="000000"/>
+            </w:tcBorders>
+            <w:shd w:val="clear" w:color="auto" w:fill="FFFFFF"/>
+            <w:tcMar>
+              <w:top w:w="0" w:type="dxa"/>
+              <w:bottom w:w="0" w:type="dxa"/>
+              <w:left w:w="0" w:type="dxa"/>
+              <w:right w:w="0" w:type="dxa"/>
+            </w:tcMar>
+            <w:vAlign w:val="center"/>
+          </w:tcPr>
+          <w:p>
+            <w:pPr>
+              <w:pStyle w:val="Normal"/>
+              <w:jc w:val="center"/>
+              <w:pBdr>
+                <w:bottom w:val="none" w:sz="0" w:space="0" w:color="000000"/>
+                <w:top w:val="none" w:sz="0" w:space="0" w:color="000000"/>
+                <w:left w:val="none" w:sz="0" w:space="0" w:color="000000"/>
+                <w:right w:val="none" w:sz="0" w:space="0" w:color="000000"/>
+              </w:pBdr>
+              <w:spacing w:after="40" w:before="40" w:line="240"/>
+              <w:ind w:left="40" w:right="40" w:firstLine="0" w:firstLineChars="0"/>
+            </w:pPr>
+            <w:r>
+              <w:rPr>
+                <w:rFonts w:ascii="Calibri" w:hAnsi="Calibri" w:eastAsia="Calibri" w:cs="Calibri"/>
+                <w:i w:val="false"/>
+                <w:b w:val="false"/>
+                <w:u w:val="none"/>
+                <w:sz w:val="16"/>
+                <w:szCs w:val="16"/>
+                <w:color w:val="000000"/>
+              </w:rPr>
               <w:t xml:space="preserve">Intercept</w:t>
             </w:r>
           </w:p>
@@ -21830,6 +23766,50 @@
                 <w:szCs w:val="16"/>
                 <w:color w:val="000000"/>
               </w:rPr>
+              <w:t xml:space="preserve">lme</w:t>
+            </w:r>
+          </w:p>
+        </w:tc>
+        <w:tc>
+          <w:tcPr>
+            <w:tcBorders>
+              <w:bottom w:val="none" w:sz="0" w:space="0" w:color="000000"/>
+              <w:top w:val="single" w:sz="8" w:space="0" w:color="000000"/>
+              <w:left w:val="none" w:sz="0" w:space="0" w:color="000000"/>
+              <w:right w:val="none" w:sz="0" w:space="0" w:color="000000"/>
+            </w:tcBorders>
+            <w:shd w:val="clear" w:color="auto" w:fill="FFFFFF"/>
+            <w:tcMar>
+              <w:top w:w="0" w:type="dxa"/>
+              <w:bottom w:w="0" w:type="dxa"/>
+              <w:left w:w="0" w:type="dxa"/>
+              <w:right w:w="0" w:type="dxa"/>
+            </w:tcMar>
+            <w:vAlign w:val="center"/>
+          </w:tcPr>
+          <w:p>
+            <w:pPr>
+              <w:pStyle w:val="Normal"/>
+              <w:jc w:val="center"/>
+              <w:pBdr>
+                <w:bottom w:val="none" w:sz="0" w:space="0" w:color="000000"/>
+                <w:top w:val="none" w:sz="0" w:space="0" w:color="000000"/>
+                <w:left w:val="none" w:sz="0" w:space="0" w:color="000000"/>
+                <w:right w:val="none" w:sz="0" w:space="0" w:color="000000"/>
+              </w:pBdr>
+              <w:spacing w:after="40" w:before="40" w:line="240"/>
+              <w:ind w:left="40" w:right="40" w:firstLine="0" w:firstLineChars="0"/>
+            </w:pPr>
+            <w:r>
+              <w:rPr>
+                <w:rFonts w:ascii="Calibri" w:hAnsi="Calibri" w:eastAsia="Calibri" w:cs="Calibri"/>
+                <w:i w:val="false"/>
+                <w:b w:val="false"/>
+                <w:u w:val="none"/>
+                <w:sz w:val="16"/>
+                <w:szCs w:val="16"/>
+                <w:color w:val="000000"/>
+              </w:rPr>
               <w:t xml:space="preserve">0.816</w:t>
             </w:r>
           </w:p>
@@ -22320,6 +24300,50 @@
                 <w:szCs w:val="16"/>
                 <w:color w:val="000000"/>
               </w:rPr>
+              <w:t xml:space="preserve"/>
+            </w:r>
+          </w:p>
+        </w:tc>
+        <w:tc>
+          <w:tcPr>
+            <w:tcBorders>
+              <w:bottom w:val="none" w:sz="0" w:space="0" w:color="000000"/>
+              <w:top w:val="none" w:sz="0" w:space="0" w:color="000000"/>
+              <w:left w:val="none" w:sz="0" w:space="0" w:color="000000"/>
+              <w:right w:val="none" w:sz="0" w:space="0" w:color="000000"/>
+            </w:tcBorders>
+            <w:shd w:val="clear" w:color="auto" w:fill="FFFFFF"/>
+            <w:tcMar>
+              <w:top w:w="0" w:type="dxa"/>
+              <w:bottom w:w="0" w:type="dxa"/>
+              <w:left w:w="0" w:type="dxa"/>
+              <w:right w:w="0" w:type="dxa"/>
+            </w:tcMar>
+            <w:vAlign w:val="center"/>
+          </w:tcPr>
+          <w:p>
+            <w:pPr>
+              <w:pStyle w:val="Normal"/>
+              <w:jc w:val="center"/>
+              <w:pBdr>
+                <w:bottom w:val="none" w:sz="0" w:space="0" w:color="000000"/>
+                <w:top w:val="none" w:sz="0" w:space="0" w:color="000000"/>
+                <w:left w:val="none" w:sz="0" w:space="0" w:color="000000"/>
+                <w:right w:val="none" w:sz="0" w:space="0" w:color="000000"/>
+              </w:pBdr>
+              <w:spacing w:after="40" w:before="40" w:line="240"/>
+              <w:ind w:left="40" w:right="40" w:firstLine="0" w:firstLineChars="0"/>
+            </w:pPr>
+            <w:r>
+              <w:rPr>
+                <w:rFonts w:ascii="Calibri" w:hAnsi="Calibri" w:eastAsia="Calibri" w:cs="Calibri"/>
+                <w:i w:val="false"/>
+                <w:b w:val="false"/>
+                <w:u w:val="none"/>
+                <w:sz w:val="16"/>
+                <w:szCs w:val="16"/>
+                <w:color w:val="000000"/>
+              </w:rPr>
               <w:t xml:space="preserve">not converged</w:t>
             </w:r>
           </w:p>
@@ -22810,6 +24834,50 @@
                 <w:szCs w:val="16"/>
                 <w:color w:val="000000"/>
               </w:rPr>
+              <w:t xml:space="preserve"/>
+            </w:r>
+          </w:p>
+        </w:tc>
+        <w:tc>
+          <w:tcPr>
+            <w:tcBorders>
+              <w:bottom w:val="single" w:sz="4" w:space="0" w:color="999999"/>
+              <w:top w:val="none" w:sz="0" w:space="0" w:color="000000"/>
+              <w:left w:val="none" w:sz="0" w:space="0" w:color="000000"/>
+              <w:right w:val="none" w:sz="0" w:space="0" w:color="000000"/>
+            </w:tcBorders>
+            <w:shd w:val="clear" w:color="auto" w:fill="FFFFFF"/>
+            <w:tcMar>
+              <w:top w:w="0" w:type="dxa"/>
+              <w:bottom w:w="0" w:type="dxa"/>
+              <w:left w:w="0" w:type="dxa"/>
+              <w:right w:w="0" w:type="dxa"/>
+            </w:tcMar>
+            <w:vAlign w:val="center"/>
+          </w:tcPr>
+          <w:p>
+            <w:pPr>
+              <w:pStyle w:val="Normal"/>
+              <w:jc w:val="center"/>
+              <w:pBdr>
+                <w:bottom w:val="none" w:sz="0" w:space="0" w:color="000000"/>
+                <w:top w:val="none" w:sz="0" w:space="0" w:color="000000"/>
+                <w:left w:val="none" w:sz="0" w:space="0" w:color="000000"/>
+                <w:right w:val="none" w:sz="0" w:space="0" w:color="000000"/>
+              </w:pBdr>
+              <w:spacing w:after="40" w:before="40" w:line="240"/>
+              <w:ind w:left="40" w:right="40" w:firstLine="0" w:firstLineChars="0"/>
+            </w:pPr>
+            <w:r>
+              <w:rPr>
+                <w:rFonts w:ascii="Calibri" w:hAnsi="Calibri" w:eastAsia="Calibri" w:cs="Calibri"/>
+                <w:i w:val="false"/>
+                <w:b w:val="false"/>
+                <w:u w:val="none"/>
+                <w:sz w:val="16"/>
+                <w:szCs w:val="16"/>
+                <w:color w:val="000000"/>
+              </w:rPr>
               <w:t xml:space="preserve">not converged</w:t>
             </w:r>
           </w:p>
@@ -23300,6 +25368,50 @@
                 <w:szCs w:val="16"/>
                 <w:color w:val="000000"/>
               </w:rPr>
+              <w:t xml:space="preserve">lme</w:t>
+            </w:r>
+          </w:p>
+        </w:tc>
+        <w:tc>
+          <w:tcPr>
+            <w:tcBorders>
+              <w:bottom w:val="none" w:sz="0" w:space="0" w:color="000000"/>
+              <w:top w:val="single" w:sz="4" w:space="0" w:color="999999"/>
+              <w:left w:val="none" w:sz="0" w:space="0" w:color="000000"/>
+              <w:right w:val="none" w:sz="0" w:space="0" w:color="000000"/>
+            </w:tcBorders>
+            <w:shd w:val="clear" w:color="auto" w:fill="FFFFFF"/>
+            <w:tcMar>
+              <w:top w:w="0" w:type="dxa"/>
+              <w:bottom w:w="0" w:type="dxa"/>
+              <w:left w:w="0" w:type="dxa"/>
+              <w:right w:w="0" w:type="dxa"/>
+            </w:tcMar>
+            <w:vAlign w:val="center"/>
+          </w:tcPr>
+          <w:p>
+            <w:pPr>
+              <w:pStyle w:val="Normal"/>
+              <w:jc w:val="center"/>
+              <w:pBdr>
+                <w:bottom w:val="none" w:sz="0" w:space="0" w:color="000000"/>
+                <w:top w:val="none" w:sz="0" w:space="0" w:color="000000"/>
+                <w:left w:val="none" w:sz="0" w:space="0" w:color="000000"/>
+                <w:right w:val="none" w:sz="0" w:space="0" w:color="000000"/>
+              </w:pBdr>
+              <w:spacing w:after="40" w:before="40" w:line="240"/>
+              <w:ind w:left="40" w:right="40" w:firstLine="0" w:firstLineChars="0"/>
+            </w:pPr>
+            <w:r>
+              <w:rPr>
+                <w:rFonts w:ascii="Calibri" w:hAnsi="Calibri" w:eastAsia="Calibri" w:cs="Calibri"/>
+                <w:i w:val="false"/>
+                <w:b w:val="false"/>
+                <w:u w:val="none"/>
+                <w:sz w:val="16"/>
+                <w:szCs w:val="16"/>
+                <w:color w:val="000000"/>
+              </w:rPr>
               <w:t xml:space="preserve">0.773</w:t>
             </w:r>
           </w:p>
@@ -23790,6 +25902,50 @@
                 <w:szCs w:val="16"/>
                 <w:color w:val="000000"/>
               </w:rPr>
+              <w:t xml:space="preserve"/>
+            </w:r>
+          </w:p>
+        </w:tc>
+        <w:tc>
+          <w:tcPr>
+            <w:tcBorders>
+              <w:bottom w:val="none" w:sz="0" w:space="0" w:color="000000"/>
+              <w:top w:val="none" w:sz="0" w:space="0" w:color="000000"/>
+              <w:left w:val="none" w:sz="0" w:space="0" w:color="000000"/>
+              <w:right w:val="none" w:sz="0" w:space="0" w:color="000000"/>
+            </w:tcBorders>
+            <w:shd w:val="clear" w:color="auto" w:fill="FFFFFF"/>
+            <w:tcMar>
+              <w:top w:w="0" w:type="dxa"/>
+              <w:bottom w:w="0" w:type="dxa"/>
+              <w:left w:w="0" w:type="dxa"/>
+              <w:right w:w="0" w:type="dxa"/>
+            </w:tcMar>
+            <w:vAlign w:val="center"/>
+          </w:tcPr>
+          <w:p>
+            <w:pPr>
+              <w:pStyle w:val="Normal"/>
+              <w:jc w:val="center"/>
+              <w:pBdr>
+                <w:bottom w:val="none" w:sz="0" w:space="0" w:color="000000"/>
+                <w:top w:val="none" w:sz="0" w:space="0" w:color="000000"/>
+                <w:left w:val="none" w:sz="0" w:space="0" w:color="000000"/>
+                <w:right w:val="none" w:sz="0" w:space="0" w:color="000000"/>
+              </w:pBdr>
+              <w:spacing w:after="40" w:before="40" w:line="240"/>
+              <w:ind w:left="40" w:right="40" w:firstLine="0" w:firstLineChars="0"/>
+            </w:pPr>
+            <w:r>
+              <w:rPr>
+                <w:rFonts w:ascii="Calibri" w:hAnsi="Calibri" w:eastAsia="Calibri" w:cs="Calibri"/>
+                <w:i w:val="false"/>
+                <w:b w:val="false"/>
+                <w:u w:val="none"/>
+                <w:sz w:val="16"/>
+                <w:szCs w:val="16"/>
+                <w:color w:val="000000"/>
+              </w:rPr>
               <w:t xml:space="preserve">not converged</w:t>
             </w:r>
           </w:p>
@@ -24280,6 +26436,50 @@
                 <w:szCs w:val="16"/>
                 <w:color w:val="000000"/>
               </w:rPr>
+              <w:t xml:space="preserve"/>
+            </w:r>
+          </w:p>
+        </w:tc>
+        <w:tc>
+          <w:tcPr>
+            <w:tcBorders>
+              <w:bottom w:val="single" w:sz="4" w:space="0" w:color="999999"/>
+              <w:top w:val="none" w:sz="0" w:space="0" w:color="000000"/>
+              <w:left w:val="none" w:sz="0" w:space="0" w:color="000000"/>
+              <w:right w:val="none" w:sz="0" w:space="0" w:color="000000"/>
+            </w:tcBorders>
+            <w:shd w:val="clear" w:color="auto" w:fill="FFFFFF"/>
+            <w:tcMar>
+              <w:top w:w="0" w:type="dxa"/>
+              <w:bottom w:w="0" w:type="dxa"/>
+              <w:left w:w="0" w:type="dxa"/>
+              <w:right w:w="0" w:type="dxa"/>
+            </w:tcMar>
+            <w:vAlign w:val="center"/>
+          </w:tcPr>
+          <w:p>
+            <w:pPr>
+              <w:pStyle w:val="Normal"/>
+              <w:jc w:val="center"/>
+              <w:pBdr>
+                <w:bottom w:val="none" w:sz="0" w:space="0" w:color="000000"/>
+                <w:top w:val="none" w:sz="0" w:space="0" w:color="000000"/>
+                <w:left w:val="none" w:sz="0" w:space="0" w:color="000000"/>
+                <w:right w:val="none" w:sz="0" w:space="0" w:color="000000"/>
+              </w:pBdr>
+              <w:spacing w:after="40" w:before="40" w:line="240"/>
+              <w:ind w:left="40" w:right="40" w:firstLine="0" w:firstLineChars="0"/>
+            </w:pPr>
+            <w:r>
+              <w:rPr>
+                <w:rFonts w:ascii="Calibri" w:hAnsi="Calibri" w:eastAsia="Calibri" w:cs="Calibri"/>
+                <w:i w:val="false"/>
+                <w:b w:val="false"/>
+                <w:u w:val="none"/>
+                <w:sz w:val="16"/>
+                <w:szCs w:val="16"/>
+                <w:color w:val="000000"/>
+              </w:rPr>
               <w:t xml:space="preserve">not converged</w:t>
             </w:r>
           </w:p>
@@ -24770,6 +26970,50 @@
                 <w:szCs w:val="16"/>
                 <w:color w:val="000000"/>
               </w:rPr>
+              <w:t xml:space="preserve">lme</w:t>
+            </w:r>
+          </w:p>
+        </w:tc>
+        <w:tc>
+          <w:tcPr>
+            <w:tcBorders>
+              <w:bottom w:val="none" w:sz="0" w:space="0" w:color="000000"/>
+              <w:top w:val="single" w:sz="4" w:space="0" w:color="999999"/>
+              <w:left w:val="none" w:sz="0" w:space="0" w:color="000000"/>
+              <w:right w:val="none" w:sz="0" w:space="0" w:color="000000"/>
+            </w:tcBorders>
+            <w:shd w:val="clear" w:color="auto" w:fill="FFFFFF"/>
+            <w:tcMar>
+              <w:top w:w="0" w:type="dxa"/>
+              <w:bottom w:w="0" w:type="dxa"/>
+              <w:left w:w="0" w:type="dxa"/>
+              <w:right w:w="0" w:type="dxa"/>
+            </w:tcMar>
+            <w:vAlign w:val="center"/>
+          </w:tcPr>
+          <w:p>
+            <w:pPr>
+              <w:pStyle w:val="Normal"/>
+              <w:jc w:val="center"/>
+              <w:pBdr>
+                <w:bottom w:val="none" w:sz="0" w:space="0" w:color="000000"/>
+                <w:top w:val="none" w:sz="0" w:space="0" w:color="000000"/>
+                <w:left w:val="none" w:sz="0" w:space="0" w:color="000000"/>
+                <w:right w:val="none" w:sz="0" w:space="0" w:color="000000"/>
+              </w:pBdr>
+              <w:spacing w:after="40" w:before="40" w:line="240"/>
+              <w:ind w:left="40" w:right="40" w:firstLine="0" w:firstLineChars="0"/>
+            </w:pPr>
+            <w:r>
+              <w:rPr>
+                <w:rFonts w:ascii="Calibri" w:hAnsi="Calibri" w:eastAsia="Calibri" w:cs="Calibri"/>
+                <w:i w:val="false"/>
+                <w:b w:val="false"/>
+                <w:u w:val="none"/>
+                <w:sz w:val="16"/>
+                <w:szCs w:val="16"/>
+                <w:color w:val="000000"/>
+              </w:rPr>
               <w:t xml:space="preserve">0.948</w:t>
             </w:r>
           </w:p>
@@ -25260,6 +27504,50 @@
                 <w:szCs w:val="16"/>
                 <w:color w:val="000000"/>
               </w:rPr>
+              <w:t xml:space="preserve"/>
+            </w:r>
+          </w:p>
+        </w:tc>
+        <w:tc>
+          <w:tcPr>
+            <w:tcBorders>
+              <w:bottom w:val="none" w:sz="0" w:space="0" w:color="000000"/>
+              <w:top w:val="none" w:sz="0" w:space="0" w:color="000000"/>
+              <w:left w:val="none" w:sz="0" w:space="0" w:color="000000"/>
+              <w:right w:val="none" w:sz="0" w:space="0" w:color="000000"/>
+            </w:tcBorders>
+            <w:shd w:val="clear" w:color="auto" w:fill="FFFFFF"/>
+            <w:tcMar>
+              <w:top w:w="0" w:type="dxa"/>
+              <w:bottom w:w="0" w:type="dxa"/>
+              <w:left w:w="0" w:type="dxa"/>
+              <w:right w:w="0" w:type="dxa"/>
+            </w:tcMar>
+            <w:vAlign w:val="center"/>
+          </w:tcPr>
+          <w:p>
+            <w:pPr>
+              <w:pStyle w:val="Normal"/>
+              <w:jc w:val="center"/>
+              <w:pBdr>
+                <w:bottom w:val="none" w:sz="0" w:space="0" w:color="000000"/>
+                <w:top w:val="none" w:sz="0" w:space="0" w:color="000000"/>
+                <w:left w:val="none" w:sz="0" w:space="0" w:color="000000"/>
+                <w:right w:val="none" w:sz="0" w:space="0" w:color="000000"/>
+              </w:pBdr>
+              <w:spacing w:after="40" w:before="40" w:line="240"/>
+              <w:ind w:left="40" w:right="40" w:firstLine="0" w:firstLineChars="0"/>
+            </w:pPr>
+            <w:r>
+              <w:rPr>
+                <w:rFonts w:ascii="Calibri" w:hAnsi="Calibri" w:eastAsia="Calibri" w:cs="Calibri"/>
+                <w:i w:val="false"/>
+                <w:b w:val="false"/>
+                <w:u w:val="none"/>
+                <w:sz w:val="16"/>
+                <w:szCs w:val="16"/>
+                <w:color w:val="000000"/>
+              </w:rPr>
               <w:t xml:space="preserve">not converged</w:t>
             </w:r>
           </w:p>
@@ -25750,6 +28038,50 @@
                 <w:szCs w:val="16"/>
                 <w:color w:val="000000"/>
               </w:rPr>
+              <w:t xml:space="preserve"/>
+            </w:r>
+          </w:p>
+        </w:tc>
+        <w:tc>
+          <w:tcPr>
+            <w:tcBorders>
+              <w:bottom w:val="single" w:sz="4" w:space="0" w:color="999999"/>
+              <w:top w:val="none" w:sz="0" w:space="0" w:color="000000"/>
+              <w:left w:val="none" w:sz="0" w:space="0" w:color="000000"/>
+              <w:right w:val="none" w:sz="0" w:space="0" w:color="000000"/>
+            </w:tcBorders>
+            <w:shd w:val="clear" w:color="auto" w:fill="FFFFFF"/>
+            <w:tcMar>
+              <w:top w:w="0" w:type="dxa"/>
+              <w:bottom w:w="0" w:type="dxa"/>
+              <w:left w:w="0" w:type="dxa"/>
+              <w:right w:w="0" w:type="dxa"/>
+            </w:tcMar>
+            <w:vAlign w:val="center"/>
+          </w:tcPr>
+          <w:p>
+            <w:pPr>
+              <w:pStyle w:val="Normal"/>
+              <w:jc w:val="center"/>
+              <w:pBdr>
+                <w:bottom w:val="none" w:sz="0" w:space="0" w:color="000000"/>
+                <w:top w:val="none" w:sz="0" w:space="0" w:color="000000"/>
+                <w:left w:val="none" w:sz="0" w:space="0" w:color="000000"/>
+                <w:right w:val="none" w:sz="0" w:space="0" w:color="000000"/>
+              </w:pBdr>
+              <w:spacing w:after="40" w:before="40" w:line="240"/>
+              <w:ind w:left="40" w:right="40" w:firstLine="0" w:firstLineChars="0"/>
+            </w:pPr>
+            <w:r>
+              <w:rPr>
+                <w:rFonts w:ascii="Calibri" w:hAnsi="Calibri" w:eastAsia="Calibri" w:cs="Calibri"/>
+                <w:i w:val="false"/>
+                <w:b w:val="false"/>
+                <w:u w:val="none"/>
+                <w:sz w:val="16"/>
+                <w:szCs w:val="16"/>
+                <w:color w:val="000000"/>
+              </w:rPr>
               <w:t xml:space="preserve">not converged</w:t>
             </w:r>
           </w:p>
@@ -26240,6 +28572,50 @@
                 <w:szCs w:val="16"/>
                 <w:color w:val="000000"/>
               </w:rPr>
+              <w:t xml:space="preserve">lme</w:t>
+            </w:r>
+          </w:p>
+        </w:tc>
+        <w:tc>
+          <w:tcPr>
+            <w:tcBorders>
+              <w:bottom w:val="none" w:sz="0" w:space="0" w:color="000000"/>
+              <w:top w:val="single" w:sz="4" w:space="0" w:color="999999"/>
+              <w:left w:val="none" w:sz="0" w:space="0" w:color="000000"/>
+              <w:right w:val="none" w:sz="0" w:space="0" w:color="000000"/>
+            </w:tcBorders>
+            <w:shd w:val="clear" w:color="auto" w:fill="FFFFFF"/>
+            <w:tcMar>
+              <w:top w:w="0" w:type="dxa"/>
+              <w:bottom w:w="0" w:type="dxa"/>
+              <w:left w:w="0" w:type="dxa"/>
+              <w:right w:w="0" w:type="dxa"/>
+            </w:tcMar>
+            <w:vAlign w:val="center"/>
+          </w:tcPr>
+          <w:p>
+            <w:pPr>
+              <w:pStyle w:val="Normal"/>
+              <w:jc w:val="center"/>
+              <w:pBdr>
+                <w:bottom w:val="none" w:sz="0" w:space="0" w:color="000000"/>
+                <w:top w:val="none" w:sz="0" w:space="0" w:color="000000"/>
+                <w:left w:val="none" w:sz="0" w:space="0" w:color="000000"/>
+                <w:right w:val="none" w:sz="0" w:space="0" w:color="000000"/>
+              </w:pBdr>
+              <w:spacing w:after="40" w:before="40" w:line="240"/>
+              <w:ind w:left="40" w:right="40" w:firstLine="0" w:firstLineChars="0"/>
+            </w:pPr>
+            <w:r>
+              <w:rPr>
+                <w:rFonts w:ascii="Calibri" w:hAnsi="Calibri" w:eastAsia="Calibri" w:cs="Calibri"/>
+                <w:i w:val="false"/>
+                <w:b w:val="false"/>
+                <w:u w:val="none"/>
+                <w:sz w:val="16"/>
+                <w:szCs w:val="16"/>
+                <w:color w:val="000000"/>
+              </w:rPr>
               <w:t xml:space="preserve">1.325</w:t>
             </w:r>
           </w:p>
@@ -26730,6 +29106,50 @@
                 <w:szCs w:val="16"/>
                 <w:color w:val="000000"/>
               </w:rPr>
+              <w:t xml:space="preserve"/>
+            </w:r>
+          </w:p>
+        </w:tc>
+        <w:tc>
+          <w:tcPr>
+            <w:tcBorders>
+              <w:bottom w:val="none" w:sz="0" w:space="0" w:color="000000"/>
+              <w:top w:val="none" w:sz="0" w:space="0" w:color="000000"/>
+              <w:left w:val="none" w:sz="0" w:space="0" w:color="000000"/>
+              <w:right w:val="none" w:sz="0" w:space="0" w:color="000000"/>
+            </w:tcBorders>
+            <w:shd w:val="clear" w:color="auto" w:fill="FFFFFF"/>
+            <w:tcMar>
+              <w:top w:w="0" w:type="dxa"/>
+              <w:bottom w:w="0" w:type="dxa"/>
+              <w:left w:w="0" w:type="dxa"/>
+              <w:right w:w="0" w:type="dxa"/>
+            </w:tcMar>
+            <w:vAlign w:val="center"/>
+          </w:tcPr>
+          <w:p>
+            <w:pPr>
+              <w:pStyle w:val="Normal"/>
+              <w:jc w:val="center"/>
+              <w:pBdr>
+                <w:bottom w:val="none" w:sz="0" w:space="0" w:color="000000"/>
+                <w:top w:val="none" w:sz="0" w:space="0" w:color="000000"/>
+                <w:left w:val="none" w:sz="0" w:space="0" w:color="000000"/>
+                <w:right w:val="none" w:sz="0" w:space="0" w:color="000000"/>
+              </w:pBdr>
+              <w:spacing w:after="40" w:before="40" w:line="240"/>
+              <w:ind w:left="40" w:right="40" w:firstLine="0" w:firstLineChars="0"/>
+            </w:pPr>
+            <w:r>
+              <w:rPr>
+                <w:rFonts w:ascii="Calibri" w:hAnsi="Calibri" w:eastAsia="Calibri" w:cs="Calibri"/>
+                <w:i w:val="false"/>
+                <w:b w:val="false"/>
+                <w:u w:val="none"/>
+                <w:sz w:val="16"/>
+                <w:szCs w:val="16"/>
+                <w:color w:val="000000"/>
+              </w:rPr>
               <w:t xml:space="preserve">not converged</w:t>
             </w:r>
           </w:p>
@@ -27220,6 +29640,50 @@
                 <w:szCs w:val="16"/>
                 <w:color w:val="000000"/>
               </w:rPr>
+              <w:t xml:space="preserve"/>
+            </w:r>
+          </w:p>
+        </w:tc>
+        <w:tc>
+          <w:tcPr>
+            <w:tcBorders>
+              <w:bottom w:val="single" w:sz="4" w:space="0" w:color="999999"/>
+              <w:top w:val="none" w:sz="0" w:space="0" w:color="000000"/>
+              <w:left w:val="none" w:sz="0" w:space="0" w:color="000000"/>
+              <w:right w:val="none" w:sz="0" w:space="0" w:color="000000"/>
+            </w:tcBorders>
+            <w:shd w:val="clear" w:color="auto" w:fill="FFFFFF"/>
+            <w:tcMar>
+              <w:top w:w="0" w:type="dxa"/>
+              <w:bottom w:w="0" w:type="dxa"/>
+              <w:left w:w="0" w:type="dxa"/>
+              <w:right w:w="0" w:type="dxa"/>
+            </w:tcMar>
+            <w:vAlign w:val="center"/>
+          </w:tcPr>
+          <w:p>
+            <w:pPr>
+              <w:pStyle w:val="Normal"/>
+              <w:jc w:val="center"/>
+              <w:pBdr>
+                <w:bottom w:val="none" w:sz="0" w:space="0" w:color="000000"/>
+                <w:top w:val="none" w:sz="0" w:space="0" w:color="000000"/>
+                <w:left w:val="none" w:sz="0" w:space="0" w:color="000000"/>
+                <w:right w:val="none" w:sz="0" w:space="0" w:color="000000"/>
+              </w:pBdr>
+              <w:spacing w:after="40" w:before="40" w:line="240"/>
+              <w:ind w:left="40" w:right="40" w:firstLine="0" w:firstLineChars="0"/>
+            </w:pPr>
+            <w:r>
+              <w:rPr>
+                <w:rFonts w:ascii="Calibri" w:hAnsi="Calibri" w:eastAsia="Calibri" w:cs="Calibri"/>
+                <w:i w:val="false"/>
+                <w:b w:val="false"/>
+                <w:u w:val="none"/>
+                <w:sz w:val="16"/>
+                <w:szCs w:val="16"/>
+                <w:color w:val="000000"/>
+              </w:rPr>
               <w:t xml:space="preserve">not converged</w:t>
             </w:r>
           </w:p>
@@ -27710,6 +30174,50 @@
                 <w:szCs w:val="16"/>
                 <w:color w:val="000000"/>
               </w:rPr>
+              <w:t xml:space="preserve">lme</w:t>
+            </w:r>
+          </w:p>
+        </w:tc>
+        <w:tc>
+          <w:tcPr>
+            <w:tcBorders>
+              <w:bottom w:val="none" w:sz="0" w:space="0" w:color="000000"/>
+              <w:top w:val="single" w:sz="4" w:space="0" w:color="999999"/>
+              <w:left w:val="none" w:sz="0" w:space="0" w:color="000000"/>
+              <w:right w:val="none" w:sz="0" w:space="0" w:color="000000"/>
+            </w:tcBorders>
+            <w:shd w:val="clear" w:color="auto" w:fill="FFFFFF"/>
+            <w:tcMar>
+              <w:top w:w="0" w:type="dxa"/>
+              <w:bottom w:w="0" w:type="dxa"/>
+              <w:left w:w="0" w:type="dxa"/>
+              <w:right w:w="0" w:type="dxa"/>
+            </w:tcMar>
+            <w:vAlign w:val="center"/>
+          </w:tcPr>
+          <w:p>
+            <w:pPr>
+              <w:pStyle w:val="Normal"/>
+              <w:jc w:val="center"/>
+              <w:pBdr>
+                <w:bottom w:val="none" w:sz="0" w:space="0" w:color="000000"/>
+                <w:top w:val="none" w:sz="0" w:space="0" w:color="000000"/>
+                <w:left w:val="none" w:sz="0" w:space="0" w:color="000000"/>
+                <w:right w:val="none" w:sz="0" w:space="0" w:color="000000"/>
+              </w:pBdr>
+              <w:spacing w:after="40" w:before="40" w:line="240"/>
+              <w:ind w:left="40" w:right="40" w:firstLine="0" w:firstLineChars="0"/>
+            </w:pPr>
+            <w:r>
+              <w:rPr>
+                <w:rFonts w:ascii="Calibri" w:hAnsi="Calibri" w:eastAsia="Calibri" w:cs="Calibri"/>
+                <w:i w:val="false"/>
+                <w:b w:val="false"/>
+                <w:u w:val="none"/>
+                <w:sz w:val="16"/>
+                <w:szCs w:val="16"/>
+                <w:color w:val="000000"/>
+              </w:rPr>
               <w:t xml:space="preserve">0.779</w:t>
             </w:r>
           </w:p>
@@ -28200,6 +30708,50 @@
                 <w:szCs w:val="16"/>
                 <w:color w:val="000000"/>
               </w:rPr>
+              <w:t xml:space="preserve"/>
+            </w:r>
+          </w:p>
+        </w:tc>
+        <w:tc>
+          <w:tcPr>
+            <w:tcBorders>
+              <w:bottom w:val="none" w:sz="0" w:space="0" w:color="000000"/>
+              <w:top w:val="none" w:sz="0" w:space="0" w:color="000000"/>
+              <w:left w:val="none" w:sz="0" w:space="0" w:color="000000"/>
+              <w:right w:val="none" w:sz="0" w:space="0" w:color="000000"/>
+            </w:tcBorders>
+            <w:shd w:val="clear" w:color="auto" w:fill="FFFFFF"/>
+            <w:tcMar>
+              <w:top w:w="0" w:type="dxa"/>
+              <w:bottom w:w="0" w:type="dxa"/>
+              <w:left w:w="0" w:type="dxa"/>
+              <w:right w:w="0" w:type="dxa"/>
+            </w:tcMar>
+            <w:vAlign w:val="center"/>
+          </w:tcPr>
+          <w:p>
+            <w:pPr>
+              <w:pStyle w:val="Normal"/>
+              <w:jc w:val="center"/>
+              <w:pBdr>
+                <w:bottom w:val="none" w:sz="0" w:space="0" w:color="000000"/>
+                <w:top w:val="none" w:sz="0" w:space="0" w:color="000000"/>
+                <w:left w:val="none" w:sz="0" w:space="0" w:color="000000"/>
+                <w:right w:val="none" w:sz="0" w:space="0" w:color="000000"/>
+              </w:pBdr>
+              <w:spacing w:after="40" w:before="40" w:line="240"/>
+              <w:ind w:left="40" w:right="40" w:firstLine="0" w:firstLineChars="0"/>
+            </w:pPr>
+            <w:r>
+              <w:rPr>
+                <w:rFonts w:ascii="Calibri" w:hAnsi="Calibri" w:eastAsia="Calibri" w:cs="Calibri"/>
+                <w:i w:val="false"/>
+                <w:b w:val="false"/>
+                <w:u w:val="none"/>
+                <w:sz w:val="16"/>
+                <w:szCs w:val="16"/>
+                <w:color w:val="000000"/>
+              </w:rPr>
               <w:t xml:space="preserve">not converged</w:t>
             </w:r>
           </w:p>
@@ -28690,6 +31242,50 @@
                 <w:szCs w:val="16"/>
                 <w:color w:val="000000"/>
               </w:rPr>
+              <w:t xml:space="preserve"/>
+            </w:r>
+          </w:p>
+        </w:tc>
+        <w:tc>
+          <w:tcPr>
+            <w:tcBorders>
+              <w:bottom w:val="single" w:sz="4" w:space="0" w:color="999999"/>
+              <w:top w:val="none" w:sz="0" w:space="0" w:color="000000"/>
+              <w:left w:val="none" w:sz="0" w:space="0" w:color="000000"/>
+              <w:right w:val="none" w:sz="0" w:space="0" w:color="000000"/>
+            </w:tcBorders>
+            <w:shd w:val="clear" w:color="auto" w:fill="FFFFFF"/>
+            <w:tcMar>
+              <w:top w:w="0" w:type="dxa"/>
+              <w:bottom w:w="0" w:type="dxa"/>
+              <w:left w:w="0" w:type="dxa"/>
+              <w:right w:w="0" w:type="dxa"/>
+            </w:tcMar>
+            <w:vAlign w:val="center"/>
+          </w:tcPr>
+          <w:p>
+            <w:pPr>
+              <w:pStyle w:val="Normal"/>
+              <w:jc w:val="center"/>
+              <w:pBdr>
+                <w:bottom w:val="none" w:sz="0" w:space="0" w:color="000000"/>
+                <w:top w:val="none" w:sz="0" w:space="0" w:color="000000"/>
+                <w:left w:val="none" w:sz="0" w:space="0" w:color="000000"/>
+                <w:right w:val="none" w:sz="0" w:space="0" w:color="000000"/>
+              </w:pBdr>
+              <w:spacing w:after="40" w:before="40" w:line="240"/>
+              <w:ind w:left="40" w:right="40" w:firstLine="0" w:firstLineChars="0"/>
+            </w:pPr>
+            <w:r>
+              <w:rPr>
+                <w:rFonts w:ascii="Calibri" w:hAnsi="Calibri" w:eastAsia="Calibri" w:cs="Calibri"/>
+                <w:i w:val="false"/>
+                <w:b w:val="false"/>
+                <w:u w:val="none"/>
+                <w:sz w:val="16"/>
+                <w:szCs w:val="16"/>
+                <w:color w:val="000000"/>
+              </w:rPr>
               <w:t xml:space="preserve">not converged</w:t>
             </w:r>
           </w:p>
@@ -29180,6 +31776,50 @@
                 <w:szCs w:val="16"/>
                 <w:color w:val="000000"/>
               </w:rPr>
+              <w:t xml:space="preserve">lme</w:t>
+            </w:r>
+          </w:p>
+        </w:tc>
+        <w:tc>
+          <w:tcPr>
+            <w:tcBorders>
+              <w:bottom w:val="none" w:sz="0" w:space="0" w:color="000000"/>
+              <w:top w:val="single" w:sz="4" w:space="0" w:color="999999"/>
+              <w:left w:val="none" w:sz="0" w:space="0" w:color="000000"/>
+              <w:right w:val="none" w:sz="0" w:space="0" w:color="000000"/>
+            </w:tcBorders>
+            <w:shd w:val="clear" w:color="auto" w:fill="FFFFFF"/>
+            <w:tcMar>
+              <w:top w:w="0" w:type="dxa"/>
+              <w:bottom w:w="0" w:type="dxa"/>
+              <w:left w:w="0" w:type="dxa"/>
+              <w:right w:w="0" w:type="dxa"/>
+            </w:tcMar>
+            <w:vAlign w:val="center"/>
+          </w:tcPr>
+          <w:p>
+            <w:pPr>
+              <w:pStyle w:val="Normal"/>
+              <w:jc w:val="center"/>
+              <w:pBdr>
+                <w:bottom w:val="none" w:sz="0" w:space="0" w:color="000000"/>
+                <w:top w:val="none" w:sz="0" w:space="0" w:color="000000"/>
+                <w:left w:val="none" w:sz="0" w:space="0" w:color="000000"/>
+                <w:right w:val="none" w:sz="0" w:space="0" w:color="000000"/>
+              </w:pBdr>
+              <w:spacing w:after="40" w:before="40" w:line="240"/>
+              <w:ind w:left="40" w:right="40" w:firstLine="0" w:firstLineChars="0"/>
+            </w:pPr>
+            <w:r>
+              <w:rPr>
+                <w:rFonts w:ascii="Calibri" w:hAnsi="Calibri" w:eastAsia="Calibri" w:cs="Calibri"/>
+                <w:i w:val="false"/>
+                <w:b w:val="false"/>
+                <w:u w:val="none"/>
+                <w:sz w:val="16"/>
+                <w:szCs w:val="16"/>
+                <w:color w:val="000000"/>
+              </w:rPr>
               <w:t xml:space="preserve">0.961</w:t>
             </w:r>
           </w:p>
@@ -29670,6 +32310,50 @@
                 <w:szCs w:val="16"/>
                 <w:color w:val="000000"/>
               </w:rPr>
+              <w:t xml:space="preserve"/>
+            </w:r>
+          </w:p>
+        </w:tc>
+        <w:tc>
+          <w:tcPr>
+            <w:tcBorders>
+              <w:bottom w:val="none" w:sz="0" w:space="0" w:color="000000"/>
+              <w:top w:val="none" w:sz="0" w:space="0" w:color="000000"/>
+              <w:left w:val="none" w:sz="0" w:space="0" w:color="000000"/>
+              <w:right w:val="none" w:sz="0" w:space="0" w:color="000000"/>
+            </w:tcBorders>
+            <w:shd w:val="clear" w:color="auto" w:fill="FFFFFF"/>
+            <w:tcMar>
+              <w:top w:w="0" w:type="dxa"/>
+              <w:bottom w:w="0" w:type="dxa"/>
+              <w:left w:w="0" w:type="dxa"/>
+              <w:right w:w="0" w:type="dxa"/>
+            </w:tcMar>
+            <w:vAlign w:val="center"/>
+          </w:tcPr>
+          <w:p>
+            <w:pPr>
+              <w:pStyle w:val="Normal"/>
+              <w:jc w:val="center"/>
+              <w:pBdr>
+                <w:bottom w:val="none" w:sz="0" w:space="0" w:color="000000"/>
+                <w:top w:val="none" w:sz="0" w:space="0" w:color="000000"/>
+                <w:left w:val="none" w:sz="0" w:space="0" w:color="000000"/>
+                <w:right w:val="none" w:sz="0" w:space="0" w:color="000000"/>
+              </w:pBdr>
+              <w:spacing w:after="40" w:before="40" w:line="240"/>
+              <w:ind w:left="40" w:right="40" w:firstLine="0" w:firstLineChars="0"/>
+            </w:pPr>
+            <w:r>
+              <w:rPr>
+                <w:rFonts w:ascii="Calibri" w:hAnsi="Calibri" w:eastAsia="Calibri" w:cs="Calibri"/>
+                <w:i w:val="false"/>
+                <w:b w:val="false"/>
+                <w:u w:val="none"/>
+                <w:sz w:val="16"/>
+                <w:szCs w:val="16"/>
+                <w:color w:val="000000"/>
+              </w:rPr>
               <w:t xml:space="preserve">not converged</w:t>
             </w:r>
           </w:p>
@@ -30160,6 +32844,50 @@
                 <w:szCs w:val="16"/>
                 <w:color w:val="000000"/>
               </w:rPr>
+              <w:t xml:space="preserve"/>
+            </w:r>
+          </w:p>
+        </w:tc>
+        <w:tc>
+          <w:tcPr>
+            <w:tcBorders>
+              <w:bottom w:val="single" w:sz="4" w:space="0" w:color="999999"/>
+              <w:top w:val="none" w:sz="0" w:space="0" w:color="000000"/>
+              <w:left w:val="none" w:sz="0" w:space="0" w:color="000000"/>
+              <w:right w:val="none" w:sz="0" w:space="0" w:color="000000"/>
+            </w:tcBorders>
+            <w:shd w:val="clear" w:color="auto" w:fill="FFFFFF"/>
+            <w:tcMar>
+              <w:top w:w="0" w:type="dxa"/>
+              <w:bottom w:w="0" w:type="dxa"/>
+              <w:left w:w="0" w:type="dxa"/>
+              <w:right w:w="0" w:type="dxa"/>
+            </w:tcMar>
+            <w:vAlign w:val="center"/>
+          </w:tcPr>
+          <w:p>
+            <w:pPr>
+              <w:pStyle w:val="Normal"/>
+              <w:jc w:val="center"/>
+              <w:pBdr>
+                <w:bottom w:val="none" w:sz="0" w:space="0" w:color="000000"/>
+                <w:top w:val="none" w:sz="0" w:space="0" w:color="000000"/>
+                <w:left w:val="none" w:sz="0" w:space="0" w:color="000000"/>
+                <w:right w:val="none" w:sz="0" w:space="0" w:color="000000"/>
+              </w:pBdr>
+              <w:spacing w:after="40" w:before="40" w:line="240"/>
+              <w:ind w:left="40" w:right="40" w:firstLine="0" w:firstLineChars="0"/>
+            </w:pPr>
+            <w:r>
+              <w:rPr>
+                <w:rFonts w:ascii="Calibri" w:hAnsi="Calibri" w:eastAsia="Calibri" w:cs="Calibri"/>
+                <w:i w:val="false"/>
+                <w:b w:val="false"/>
+                <w:u w:val="none"/>
+                <w:sz w:val="16"/>
+                <w:szCs w:val="16"/>
+                <w:color w:val="000000"/>
+              </w:rPr>
               <w:t xml:space="preserve">not converged</w:t>
             </w:r>
           </w:p>
@@ -30650,6 +33378,50 @@
                 <w:szCs w:val="16"/>
                 <w:color w:val="000000"/>
               </w:rPr>
+              <w:t xml:space="preserve">lme</w:t>
+            </w:r>
+          </w:p>
+        </w:tc>
+        <w:tc>
+          <w:tcPr>
+            <w:tcBorders>
+              <w:bottom w:val="none" w:sz="0" w:space="0" w:color="000000"/>
+              <w:top w:val="single" w:sz="4" w:space="0" w:color="999999"/>
+              <w:left w:val="none" w:sz="0" w:space="0" w:color="000000"/>
+              <w:right w:val="none" w:sz="0" w:space="0" w:color="000000"/>
+            </w:tcBorders>
+            <w:shd w:val="clear" w:color="auto" w:fill="FFFFFF"/>
+            <w:tcMar>
+              <w:top w:w="0" w:type="dxa"/>
+              <w:bottom w:w="0" w:type="dxa"/>
+              <w:left w:w="0" w:type="dxa"/>
+              <w:right w:w="0" w:type="dxa"/>
+            </w:tcMar>
+            <w:vAlign w:val="center"/>
+          </w:tcPr>
+          <w:p>
+            <w:pPr>
+              <w:pStyle w:val="Normal"/>
+              <w:jc w:val="center"/>
+              <w:pBdr>
+                <w:bottom w:val="none" w:sz="0" w:space="0" w:color="000000"/>
+                <w:top w:val="none" w:sz="0" w:space="0" w:color="000000"/>
+                <w:left w:val="none" w:sz="0" w:space="0" w:color="000000"/>
+                <w:right w:val="none" w:sz="0" w:space="0" w:color="000000"/>
+              </w:pBdr>
+              <w:spacing w:after="40" w:before="40" w:line="240"/>
+              <w:ind w:left="40" w:right="40" w:firstLine="0" w:firstLineChars="0"/>
+            </w:pPr>
+            <w:r>
+              <w:rPr>
+                <w:rFonts w:ascii="Calibri" w:hAnsi="Calibri" w:eastAsia="Calibri" w:cs="Calibri"/>
+                <w:i w:val="false"/>
+                <w:b w:val="false"/>
+                <w:u w:val="none"/>
+                <w:sz w:val="16"/>
+                <w:szCs w:val="16"/>
+                <w:color w:val="000000"/>
+              </w:rPr>
               <w:t xml:space="preserve">0.947</w:t>
             </w:r>
           </w:p>
@@ -31140,6 +33912,50 @@
                 <w:szCs w:val="16"/>
                 <w:color w:val="000000"/>
               </w:rPr>
+              <w:t xml:space="preserve"/>
+            </w:r>
+          </w:p>
+        </w:tc>
+        <w:tc>
+          <w:tcPr>
+            <w:tcBorders>
+              <w:bottom w:val="none" w:sz="0" w:space="0" w:color="000000"/>
+              <w:top w:val="none" w:sz="0" w:space="0" w:color="000000"/>
+              <w:left w:val="none" w:sz="0" w:space="0" w:color="000000"/>
+              <w:right w:val="none" w:sz="0" w:space="0" w:color="000000"/>
+            </w:tcBorders>
+            <w:shd w:val="clear" w:color="auto" w:fill="FFFFFF"/>
+            <w:tcMar>
+              <w:top w:w="0" w:type="dxa"/>
+              <w:bottom w:w="0" w:type="dxa"/>
+              <w:left w:w="0" w:type="dxa"/>
+              <w:right w:w="0" w:type="dxa"/>
+            </w:tcMar>
+            <w:vAlign w:val="center"/>
+          </w:tcPr>
+          <w:p>
+            <w:pPr>
+              <w:pStyle w:val="Normal"/>
+              <w:jc w:val="center"/>
+              <w:pBdr>
+                <w:bottom w:val="none" w:sz="0" w:space="0" w:color="000000"/>
+                <w:top w:val="none" w:sz="0" w:space="0" w:color="000000"/>
+                <w:left w:val="none" w:sz="0" w:space="0" w:color="000000"/>
+                <w:right w:val="none" w:sz="0" w:space="0" w:color="000000"/>
+              </w:pBdr>
+              <w:spacing w:after="40" w:before="40" w:line="240"/>
+              <w:ind w:left="40" w:right="40" w:firstLine="0" w:firstLineChars="0"/>
+            </w:pPr>
+            <w:r>
+              <w:rPr>
+                <w:rFonts w:ascii="Calibri" w:hAnsi="Calibri" w:eastAsia="Calibri" w:cs="Calibri"/>
+                <w:i w:val="false"/>
+                <w:b w:val="false"/>
+                <w:u w:val="none"/>
+                <w:sz w:val="16"/>
+                <w:szCs w:val="16"/>
+                <w:color w:val="000000"/>
+              </w:rPr>
               <w:t xml:space="preserve">not converged</w:t>
             </w:r>
           </w:p>
@@ -31630,6 +34446,50 @@
                 <w:szCs w:val="16"/>
                 <w:color w:val="000000"/>
               </w:rPr>
+              <w:t xml:space="preserve"/>
+            </w:r>
+          </w:p>
+        </w:tc>
+        <w:tc>
+          <w:tcPr>
+            <w:tcBorders>
+              <w:bottom w:val="single" w:sz="4" w:space="0" w:color="999999"/>
+              <w:top w:val="none" w:sz="0" w:space="0" w:color="000000"/>
+              <w:left w:val="none" w:sz="0" w:space="0" w:color="000000"/>
+              <w:right w:val="none" w:sz="0" w:space="0" w:color="000000"/>
+            </w:tcBorders>
+            <w:shd w:val="clear" w:color="auto" w:fill="FFFFFF"/>
+            <w:tcMar>
+              <w:top w:w="0" w:type="dxa"/>
+              <w:bottom w:w="0" w:type="dxa"/>
+              <w:left w:w="0" w:type="dxa"/>
+              <w:right w:w="0" w:type="dxa"/>
+            </w:tcMar>
+            <w:vAlign w:val="center"/>
+          </w:tcPr>
+          <w:p>
+            <w:pPr>
+              <w:pStyle w:val="Normal"/>
+              <w:jc w:val="center"/>
+              <w:pBdr>
+                <w:bottom w:val="none" w:sz="0" w:space="0" w:color="000000"/>
+                <w:top w:val="none" w:sz="0" w:space="0" w:color="000000"/>
+                <w:left w:val="none" w:sz="0" w:space="0" w:color="000000"/>
+                <w:right w:val="none" w:sz="0" w:space="0" w:color="000000"/>
+              </w:pBdr>
+              <w:spacing w:after="40" w:before="40" w:line="240"/>
+              <w:ind w:left="40" w:right="40" w:firstLine="0" w:firstLineChars="0"/>
+            </w:pPr>
+            <w:r>
+              <w:rPr>
+                <w:rFonts w:ascii="Calibri" w:hAnsi="Calibri" w:eastAsia="Calibri" w:cs="Calibri"/>
+                <w:i w:val="false"/>
+                <w:b w:val="false"/>
+                <w:u w:val="none"/>
+                <w:sz w:val="16"/>
+                <w:szCs w:val="16"/>
+                <w:color w:val="000000"/>
+              </w:rPr>
               <w:t xml:space="preserve">not converged</w:t>
             </w:r>
           </w:p>
@@ -32120,6 +34980,50 @@
                 <w:szCs w:val="16"/>
                 <w:color w:val="000000"/>
               </w:rPr>
+              <w:t xml:space="preserve">lme</w:t>
+            </w:r>
+          </w:p>
+        </w:tc>
+        <w:tc>
+          <w:tcPr>
+            <w:tcBorders>
+              <w:bottom w:val="none" w:sz="0" w:space="0" w:color="000000"/>
+              <w:top w:val="single" w:sz="4" w:space="0" w:color="999999"/>
+              <w:left w:val="none" w:sz="0" w:space="0" w:color="000000"/>
+              <w:right w:val="none" w:sz="0" w:space="0" w:color="000000"/>
+            </w:tcBorders>
+            <w:shd w:val="clear" w:color="auto" w:fill="FFFFFF"/>
+            <w:tcMar>
+              <w:top w:w="0" w:type="dxa"/>
+              <w:bottom w:w="0" w:type="dxa"/>
+              <w:left w:w="0" w:type="dxa"/>
+              <w:right w:w="0" w:type="dxa"/>
+            </w:tcMar>
+            <w:vAlign w:val="center"/>
+          </w:tcPr>
+          <w:p>
+            <w:pPr>
+              <w:pStyle w:val="Normal"/>
+              <w:jc w:val="center"/>
+              <w:pBdr>
+                <w:bottom w:val="none" w:sz="0" w:space="0" w:color="000000"/>
+                <w:top w:val="none" w:sz="0" w:space="0" w:color="000000"/>
+                <w:left w:val="none" w:sz="0" w:space="0" w:color="000000"/>
+                <w:right w:val="none" w:sz="0" w:space="0" w:color="000000"/>
+              </w:pBdr>
+              <w:spacing w:after="40" w:before="40" w:line="240"/>
+              <w:ind w:left="40" w:right="40" w:firstLine="0" w:firstLineChars="0"/>
+            </w:pPr>
+            <w:r>
+              <w:rPr>
+                <w:rFonts w:ascii="Calibri" w:hAnsi="Calibri" w:eastAsia="Calibri" w:cs="Calibri"/>
+                <w:i w:val="false"/>
+                <w:b w:val="false"/>
+                <w:u w:val="none"/>
+                <w:sz w:val="16"/>
+                <w:szCs w:val="16"/>
+                <w:color w:val="000000"/>
+              </w:rPr>
               <w:t xml:space="preserve">1.251</w:t>
             </w:r>
           </w:p>
@@ -32610,6 +35514,50 @@
                 <w:szCs w:val="16"/>
                 <w:color w:val="000000"/>
               </w:rPr>
+              <w:t xml:space="preserve"/>
+            </w:r>
+          </w:p>
+        </w:tc>
+        <w:tc>
+          <w:tcPr>
+            <w:tcBorders>
+              <w:bottom w:val="none" w:sz="0" w:space="0" w:color="000000"/>
+              <w:top w:val="none" w:sz="0" w:space="0" w:color="000000"/>
+              <w:left w:val="none" w:sz="0" w:space="0" w:color="000000"/>
+              <w:right w:val="none" w:sz="0" w:space="0" w:color="000000"/>
+            </w:tcBorders>
+            <w:shd w:val="clear" w:color="auto" w:fill="FFFFFF"/>
+            <w:tcMar>
+              <w:top w:w="0" w:type="dxa"/>
+              <w:bottom w:w="0" w:type="dxa"/>
+              <w:left w:w="0" w:type="dxa"/>
+              <w:right w:w="0" w:type="dxa"/>
+            </w:tcMar>
+            <w:vAlign w:val="center"/>
+          </w:tcPr>
+          <w:p>
+            <w:pPr>
+              <w:pStyle w:val="Normal"/>
+              <w:jc w:val="center"/>
+              <w:pBdr>
+                <w:bottom w:val="none" w:sz="0" w:space="0" w:color="000000"/>
+                <w:top w:val="none" w:sz="0" w:space="0" w:color="000000"/>
+                <w:left w:val="none" w:sz="0" w:space="0" w:color="000000"/>
+                <w:right w:val="none" w:sz="0" w:space="0" w:color="000000"/>
+              </w:pBdr>
+              <w:spacing w:after="40" w:before="40" w:line="240"/>
+              <w:ind w:left="40" w:right="40" w:firstLine="0" w:firstLineChars="0"/>
+            </w:pPr>
+            <w:r>
+              <w:rPr>
+                <w:rFonts w:ascii="Calibri" w:hAnsi="Calibri" w:eastAsia="Calibri" w:cs="Calibri"/>
+                <w:i w:val="false"/>
+                <w:b w:val="false"/>
+                <w:u w:val="none"/>
+                <w:sz w:val="16"/>
+                <w:szCs w:val="16"/>
+                <w:color w:val="000000"/>
+              </w:rPr>
               <w:t xml:space="preserve">not converged</w:t>
             </w:r>
           </w:p>
@@ -33100,6 +36048,50 @@
                 <w:szCs w:val="16"/>
                 <w:color w:val="000000"/>
               </w:rPr>
+              <w:t xml:space="preserve"/>
+            </w:r>
+          </w:p>
+        </w:tc>
+        <w:tc>
+          <w:tcPr>
+            <w:tcBorders>
+              <w:bottom w:val="single" w:sz="4" w:space="0" w:color="999999"/>
+              <w:top w:val="none" w:sz="0" w:space="0" w:color="000000"/>
+              <w:left w:val="none" w:sz="0" w:space="0" w:color="000000"/>
+              <w:right w:val="none" w:sz="0" w:space="0" w:color="000000"/>
+            </w:tcBorders>
+            <w:shd w:val="clear" w:color="auto" w:fill="FFFFFF"/>
+            <w:tcMar>
+              <w:top w:w="0" w:type="dxa"/>
+              <w:bottom w:w="0" w:type="dxa"/>
+              <w:left w:w="0" w:type="dxa"/>
+              <w:right w:w="0" w:type="dxa"/>
+            </w:tcMar>
+            <w:vAlign w:val="center"/>
+          </w:tcPr>
+          <w:p>
+            <w:pPr>
+              <w:pStyle w:val="Normal"/>
+              <w:jc w:val="center"/>
+              <w:pBdr>
+                <w:bottom w:val="none" w:sz="0" w:space="0" w:color="000000"/>
+                <w:top w:val="none" w:sz="0" w:space="0" w:color="000000"/>
+                <w:left w:val="none" w:sz="0" w:space="0" w:color="000000"/>
+                <w:right w:val="none" w:sz="0" w:space="0" w:color="000000"/>
+              </w:pBdr>
+              <w:spacing w:after="40" w:before="40" w:line="240"/>
+              <w:ind w:left="40" w:right="40" w:firstLine="0" w:firstLineChars="0"/>
+            </w:pPr>
+            <w:r>
+              <w:rPr>
+                <w:rFonts w:ascii="Calibri" w:hAnsi="Calibri" w:eastAsia="Calibri" w:cs="Calibri"/>
+                <w:i w:val="false"/>
+                <w:b w:val="false"/>
+                <w:u w:val="none"/>
+                <w:sz w:val="16"/>
+                <w:szCs w:val="16"/>
+                <w:color w:val="000000"/>
+              </w:rPr>
               <w:t xml:space="preserve">not converged</w:t>
             </w:r>
           </w:p>
@@ -33590,6 +36582,50 @@
                 <w:szCs w:val="16"/>
                 <w:color w:val="000000"/>
               </w:rPr>
+              <w:t xml:space="preserve">lme</w:t>
+            </w:r>
+          </w:p>
+        </w:tc>
+        <w:tc>
+          <w:tcPr>
+            <w:tcBorders>
+              <w:bottom w:val="none" w:sz="0" w:space="0" w:color="000000"/>
+              <w:top w:val="single" w:sz="4" w:space="0" w:color="999999"/>
+              <w:left w:val="none" w:sz="0" w:space="0" w:color="000000"/>
+              <w:right w:val="none" w:sz="0" w:space="0" w:color="000000"/>
+            </w:tcBorders>
+            <w:shd w:val="clear" w:color="auto" w:fill="FFFFFF"/>
+            <w:tcMar>
+              <w:top w:w="0" w:type="dxa"/>
+              <w:bottom w:w="0" w:type="dxa"/>
+              <w:left w:w="0" w:type="dxa"/>
+              <w:right w:w="0" w:type="dxa"/>
+            </w:tcMar>
+            <w:vAlign w:val="center"/>
+          </w:tcPr>
+          <w:p>
+            <w:pPr>
+              <w:pStyle w:val="Normal"/>
+              <w:jc w:val="center"/>
+              <w:pBdr>
+                <w:bottom w:val="none" w:sz="0" w:space="0" w:color="000000"/>
+                <w:top w:val="none" w:sz="0" w:space="0" w:color="000000"/>
+                <w:left w:val="none" w:sz="0" w:space="0" w:color="000000"/>
+                <w:right w:val="none" w:sz="0" w:space="0" w:color="000000"/>
+              </w:pBdr>
+              <w:spacing w:after="40" w:before="40" w:line="240"/>
+              <w:ind w:left="40" w:right="40" w:firstLine="0" w:firstLineChars="0"/>
+            </w:pPr>
+            <w:r>
+              <w:rPr>
+                <w:rFonts w:ascii="Calibri" w:hAnsi="Calibri" w:eastAsia="Calibri" w:cs="Calibri"/>
+                <w:i w:val="false"/>
+                <w:b w:val="false"/>
+                <w:u w:val="none"/>
+                <w:sz w:val="16"/>
+                <w:szCs w:val="16"/>
+                <w:color w:val="000000"/>
+              </w:rPr>
               <w:t xml:space="preserve">1.139</w:t>
             </w:r>
           </w:p>
@@ -34080,6 +37116,50 @@
                 <w:szCs w:val="16"/>
                 <w:color w:val="000000"/>
               </w:rPr>
+              <w:t xml:space="preserve"/>
+            </w:r>
+          </w:p>
+        </w:tc>
+        <w:tc>
+          <w:tcPr>
+            <w:tcBorders>
+              <w:bottom w:val="none" w:sz="0" w:space="0" w:color="000000"/>
+              <w:top w:val="none" w:sz="0" w:space="0" w:color="000000"/>
+              <w:left w:val="none" w:sz="0" w:space="0" w:color="000000"/>
+              <w:right w:val="none" w:sz="0" w:space="0" w:color="000000"/>
+            </w:tcBorders>
+            <w:shd w:val="clear" w:color="auto" w:fill="FFFFFF"/>
+            <w:tcMar>
+              <w:top w:w="0" w:type="dxa"/>
+              <w:bottom w:w="0" w:type="dxa"/>
+              <w:left w:w="0" w:type="dxa"/>
+              <w:right w:w="0" w:type="dxa"/>
+            </w:tcMar>
+            <w:vAlign w:val="center"/>
+          </w:tcPr>
+          <w:p>
+            <w:pPr>
+              <w:pStyle w:val="Normal"/>
+              <w:jc w:val="center"/>
+              <w:pBdr>
+                <w:bottom w:val="none" w:sz="0" w:space="0" w:color="000000"/>
+                <w:top w:val="none" w:sz="0" w:space="0" w:color="000000"/>
+                <w:left w:val="none" w:sz="0" w:space="0" w:color="000000"/>
+                <w:right w:val="none" w:sz="0" w:space="0" w:color="000000"/>
+              </w:pBdr>
+              <w:spacing w:after="40" w:before="40" w:line="240"/>
+              <w:ind w:left="40" w:right="40" w:firstLine="0" w:firstLineChars="0"/>
+            </w:pPr>
+            <w:r>
+              <w:rPr>
+                <w:rFonts w:ascii="Calibri" w:hAnsi="Calibri" w:eastAsia="Calibri" w:cs="Calibri"/>
+                <w:i w:val="false"/>
+                <w:b w:val="false"/>
+                <w:u w:val="none"/>
+                <w:sz w:val="16"/>
+                <w:szCs w:val="16"/>
+                <w:color w:val="000000"/>
+              </w:rPr>
               <w:t xml:space="preserve">not converged</w:t>
             </w:r>
           </w:p>
@@ -34570,6 +37650,50 @@
                 <w:szCs w:val="16"/>
                 <w:color w:val="000000"/>
               </w:rPr>
+              <w:t xml:space="preserve"/>
+            </w:r>
+          </w:p>
+        </w:tc>
+        <w:tc>
+          <w:tcPr>
+            <w:tcBorders>
+              <w:bottom w:val="single" w:sz="4" w:space="0" w:color="999999"/>
+              <w:top w:val="none" w:sz="0" w:space="0" w:color="000000"/>
+              <w:left w:val="none" w:sz="0" w:space="0" w:color="000000"/>
+              <w:right w:val="none" w:sz="0" w:space="0" w:color="000000"/>
+            </w:tcBorders>
+            <w:shd w:val="clear" w:color="auto" w:fill="FFFFFF"/>
+            <w:tcMar>
+              <w:top w:w="0" w:type="dxa"/>
+              <w:bottom w:w="0" w:type="dxa"/>
+              <w:left w:w="0" w:type="dxa"/>
+              <w:right w:w="0" w:type="dxa"/>
+            </w:tcMar>
+            <w:vAlign w:val="center"/>
+          </w:tcPr>
+          <w:p>
+            <w:pPr>
+              <w:pStyle w:val="Normal"/>
+              <w:jc w:val="center"/>
+              <w:pBdr>
+                <w:bottom w:val="none" w:sz="0" w:space="0" w:color="000000"/>
+                <w:top w:val="none" w:sz="0" w:space="0" w:color="000000"/>
+                <w:left w:val="none" w:sz="0" w:space="0" w:color="000000"/>
+                <w:right w:val="none" w:sz="0" w:space="0" w:color="000000"/>
+              </w:pBdr>
+              <w:spacing w:after="40" w:before="40" w:line="240"/>
+              <w:ind w:left="40" w:right="40" w:firstLine="0" w:firstLineChars="0"/>
+            </w:pPr>
+            <w:r>
+              <w:rPr>
+                <w:rFonts w:ascii="Calibri" w:hAnsi="Calibri" w:eastAsia="Calibri" w:cs="Calibri"/>
+                <w:i w:val="false"/>
+                <w:b w:val="false"/>
+                <w:u w:val="none"/>
+                <w:sz w:val="16"/>
+                <w:szCs w:val="16"/>
+                <w:color w:val="000000"/>
+              </w:rPr>
               <w:t xml:space="preserve">not converged</w:t>
             </w:r>
           </w:p>
@@ -35060,6 +38184,50 @@
                 <w:szCs w:val="16"/>
                 <w:color w:val="000000"/>
               </w:rPr>
+              <w:t xml:space="preserve">lme</w:t>
+            </w:r>
+          </w:p>
+        </w:tc>
+        <w:tc>
+          <w:tcPr>
+            <w:tcBorders>
+              <w:bottom w:val="none" w:sz="0" w:space="0" w:color="000000"/>
+              <w:top w:val="single" w:sz="4" w:space="0" w:color="999999"/>
+              <w:left w:val="none" w:sz="0" w:space="0" w:color="000000"/>
+              <w:right w:val="none" w:sz="0" w:space="0" w:color="000000"/>
+            </w:tcBorders>
+            <w:shd w:val="clear" w:color="auto" w:fill="FFFFFF"/>
+            <w:tcMar>
+              <w:top w:w="0" w:type="dxa"/>
+              <w:bottom w:w="0" w:type="dxa"/>
+              <w:left w:w="0" w:type="dxa"/>
+              <w:right w:w="0" w:type="dxa"/>
+            </w:tcMar>
+            <w:vAlign w:val="center"/>
+          </w:tcPr>
+          <w:p>
+            <w:pPr>
+              <w:pStyle w:val="Normal"/>
+              <w:jc w:val="center"/>
+              <w:pBdr>
+                <w:bottom w:val="none" w:sz="0" w:space="0" w:color="000000"/>
+                <w:top w:val="none" w:sz="0" w:space="0" w:color="000000"/>
+                <w:left w:val="none" w:sz="0" w:space="0" w:color="000000"/>
+                <w:right w:val="none" w:sz="0" w:space="0" w:color="000000"/>
+              </w:pBdr>
+              <w:spacing w:after="40" w:before="40" w:line="240"/>
+              <w:ind w:left="40" w:right="40" w:firstLine="0" w:firstLineChars="0"/>
+            </w:pPr>
+            <w:r>
+              <w:rPr>
+                <w:rFonts w:ascii="Calibri" w:hAnsi="Calibri" w:eastAsia="Calibri" w:cs="Calibri"/>
+                <w:i w:val="false"/>
+                <w:b w:val="false"/>
+                <w:u w:val="none"/>
+                <w:sz w:val="16"/>
+                <w:szCs w:val="16"/>
+                <w:color w:val="000000"/>
+              </w:rPr>
               <w:t xml:space="preserve">0.549</w:t>
             </w:r>
           </w:p>
@@ -35550,6 +38718,50 @@
                 <w:szCs w:val="16"/>
                 <w:color w:val="000000"/>
               </w:rPr>
+              <w:t xml:space="preserve"/>
+            </w:r>
+          </w:p>
+        </w:tc>
+        <w:tc>
+          <w:tcPr>
+            <w:tcBorders>
+              <w:bottom w:val="none" w:sz="0" w:space="0" w:color="000000"/>
+              <w:top w:val="none" w:sz="0" w:space="0" w:color="000000"/>
+              <w:left w:val="none" w:sz="0" w:space="0" w:color="000000"/>
+              <w:right w:val="none" w:sz="0" w:space="0" w:color="000000"/>
+            </w:tcBorders>
+            <w:shd w:val="clear" w:color="auto" w:fill="FFFFFF"/>
+            <w:tcMar>
+              <w:top w:w="0" w:type="dxa"/>
+              <w:bottom w:w="0" w:type="dxa"/>
+              <w:left w:w="0" w:type="dxa"/>
+              <w:right w:w="0" w:type="dxa"/>
+            </w:tcMar>
+            <w:vAlign w:val="center"/>
+          </w:tcPr>
+          <w:p>
+            <w:pPr>
+              <w:pStyle w:val="Normal"/>
+              <w:jc w:val="center"/>
+              <w:pBdr>
+                <w:bottom w:val="none" w:sz="0" w:space="0" w:color="000000"/>
+                <w:top w:val="none" w:sz="0" w:space="0" w:color="000000"/>
+                <w:left w:val="none" w:sz="0" w:space="0" w:color="000000"/>
+                <w:right w:val="none" w:sz="0" w:space="0" w:color="000000"/>
+              </w:pBdr>
+              <w:spacing w:after="40" w:before="40" w:line="240"/>
+              <w:ind w:left="40" w:right="40" w:firstLine="0" w:firstLineChars="0"/>
+            </w:pPr>
+            <w:r>
+              <w:rPr>
+                <w:rFonts w:ascii="Calibri" w:hAnsi="Calibri" w:eastAsia="Calibri" w:cs="Calibri"/>
+                <w:i w:val="false"/>
+                <w:b w:val="false"/>
+                <w:u w:val="none"/>
+                <w:sz w:val="16"/>
+                <w:szCs w:val="16"/>
+                <w:color w:val="000000"/>
+              </w:rPr>
               <w:t xml:space="preserve">not converged</w:t>
             </w:r>
           </w:p>
@@ -36040,6 +39252,50 @@
                 <w:szCs w:val="16"/>
                 <w:color w:val="000000"/>
               </w:rPr>
+              <w:t xml:space="preserve"/>
+            </w:r>
+          </w:p>
+        </w:tc>
+        <w:tc>
+          <w:tcPr>
+            <w:tcBorders>
+              <w:bottom w:val="single" w:sz="4" w:space="0" w:color="999999"/>
+              <w:top w:val="none" w:sz="0" w:space="0" w:color="000000"/>
+              <w:left w:val="none" w:sz="0" w:space="0" w:color="000000"/>
+              <w:right w:val="none" w:sz="0" w:space="0" w:color="000000"/>
+            </w:tcBorders>
+            <w:shd w:val="clear" w:color="auto" w:fill="FFFFFF"/>
+            <w:tcMar>
+              <w:top w:w="0" w:type="dxa"/>
+              <w:bottom w:w="0" w:type="dxa"/>
+              <w:left w:w="0" w:type="dxa"/>
+              <w:right w:w="0" w:type="dxa"/>
+            </w:tcMar>
+            <w:vAlign w:val="center"/>
+          </w:tcPr>
+          <w:p>
+            <w:pPr>
+              <w:pStyle w:val="Normal"/>
+              <w:jc w:val="center"/>
+              <w:pBdr>
+                <w:bottom w:val="none" w:sz="0" w:space="0" w:color="000000"/>
+                <w:top w:val="none" w:sz="0" w:space="0" w:color="000000"/>
+                <w:left w:val="none" w:sz="0" w:space="0" w:color="000000"/>
+                <w:right w:val="none" w:sz="0" w:space="0" w:color="000000"/>
+              </w:pBdr>
+              <w:spacing w:after="40" w:before="40" w:line="240"/>
+              <w:ind w:left="40" w:right="40" w:firstLine="0" w:firstLineChars="0"/>
+            </w:pPr>
+            <w:r>
+              <w:rPr>
+                <w:rFonts w:ascii="Calibri" w:hAnsi="Calibri" w:eastAsia="Calibri" w:cs="Calibri"/>
+                <w:i w:val="false"/>
+                <w:b w:val="false"/>
+                <w:u w:val="none"/>
+                <w:sz w:val="16"/>
+                <w:szCs w:val="16"/>
+                <w:color w:val="000000"/>
+              </w:rPr>
               <w:t xml:space="preserve">not converged</w:t>
             </w:r>
           </w:p>
@@ -36530,6 +39786,50 @@
                 <w:szCs w:val="16"/>
                 <w:color w:val="000000"/>
               </w:rPr>
+              <w:t xml:space="preserve">lme</w:t>
+            </w:r>
+          </w:p>
+        </w:tc>
+        <w:tc>
+          <w:tcPr>
+            <w:tcBorders>
+              <w:bottom w:val="none" w:sz="0" w:space="0" w:color="000000"/>
+              <w:top w:val="single" w:sz="4" w:space="0" w:color="999999"/>
+              <w:left w:val="none" w:sz="0" w:space="0" w:color="000000"/>
+              <w:right w:val="none" w:sz="0" w:space="0" w:color="000000"/>
+            </w:tcBorders>
+            <w:shd w:val="clear" w:color="auto" w:fill="FFFFFF"/>
+            <w:tcMar>
+              <w:top w:w="0" w:type="dxa"/>
+              <w:bottom w:w="0" w:type="dxa"/>
+              <w:left w:w="0" w:type="dxa"/>
+              <w:right w:w="0" w:type="dxa"/>
+            </w:tcMar>
+            <w:vAlign w:val="center"/>
+          </w:tcPr>
+          <w:p>
+            <w:pPr>
+              <w:pStyle w:val="Normal"/>
+              <w:jc w:val="center"/>
+              <w:pBdr>
+                <w:bottom w:val="none" w:sz="0" w:space="0" w:color="000000"/>
+                <w:top w:val="none" w:sz="0" w:space="0" w:color="000000"/>
+                <w:left w:val="none" w:sz="0" w:space="0" w:color="000000"/>
+                <w:right w:val="none" w:sz="0" w:space="0" w:color="000000"/>
+              </w:pBdr>
+              <w:spacing w:after="40" w:before="40" w:line="240"/>
+              <w:ind w:left="40" w:right="40" w:firstLine="0" w:firstLineChars="0"/>
+            </w:pPr>
+            <w:r>
+              <w:rPr>
+                <w:rFonts w:ascii="Calibri" w:hAnsi="Calibri" w:eastAsia="Calibri" w:cs="Calibri"/>
+                <w:i w:val="false"/>
+                <w:b w:val="false"/>
+                <w:u w:val="none"/>
+                <w:sz w:val="16"/>
+                <w:szCs w:val="16"/>
+                <w:color w:val="000000"/>
+              </w:rPr>
               <w:t xml:space="preserve">0.558</w:t>
             </w:r>
           </w:p>
@@ -37020,6 +40320,50 @@
                 <w:szCs w:val="16"/>
                 <w:color w:val="000000"/>
               </w:rPr>
+              <w:t xml:space="preserve"/>
+            </w:r>
+          </w:p>
+        </w:tc>
+        <w:tc>
+          <w:tcPr>
+            <w:tcBorders>
+              <w:bottom w:val="none" w:sz="0" w:space="0" w:color="000000"/>
+              <w:top w:val="none" w:sz="0" w:space="0" w:color="000000"/>
+              <w:left w:val="none" w:sz="0" w:space="0" w:color="000000"/>
+              <w:right w:val="none" w:sz="0" w:space="0" w:color="000000"/>
+            </w:tcBorders>
+            <w:shd w:val="clear" w:color="auto" w:fill="FFFFFF"/>
+            <w:tcMar>
+              <w:top w:w="0" w:type="dxa"/>
+              <w:bottom w:w="0" w:type="dxa"/>
+              <w:left w:w="0" w:type="dxa"/>
+              <w:right w:w="0" w:type="dxa"/>
+            </w:tcMar>
+            <w:vAlign w:val="center"/>
+          </w:tcPr>
+          <w:p>
+            <w:pPr>
+              <w:pStyle w:val="Normal"/>
+              <w:jc w:val="center"/>
+              <w:pBdr>
+                <w:bottom w:val="none" w:sz="0" w:space="0" w:color="000000"/>
+                <w:top w:val="none" w:sz="0" w:space="0" w:color="000000"/>
+                <w:left w:val="none" w:sz="0" w:space="0" w:color="000000"/>
+                <w:right w:val="none" w:sz="0" w:space="0" w:color="000000"/>
+              </w:pBdr>
+              <w:spacing w:after="40" w:before="40" w:line="240"/>
+              <w:ind w:left="40" w:right="40" w:firstLine="0" w:firstLineChars="0"/>
+            </w:pPr>
+            <w:r>
+              <w:rPr>
+                <w:rFonts w:ascii="Calibri" w:hAnsi="Calibri" w:eastAsia="Calibri" w:cs="Calibri"/>
+                <w:i w:val="false"/>
+                <w:b w:val="false"/>
+                <w:u w:val="none"/>
+                <w:sz w:val="16"/>
+                <w:szCs w:val="16"/>
+                <w:color w:val="000000"/>
+              </w:rPr>
               <w:t xml:space="preserve">not converged</w:t>
             </w:r>
           </w:p>
@@ -37510,6 +40854,50 @@
                 <w:szCs w:val="16"/>
                 <w:color w:val="000000"/>
               </w:rPr>
+              <w:t xml:space="preserve"/>
+            </w:r>
+          </w:p>
+        </w:tc>
+        <w:tc>
+          <w:tcPr>
+            <w:tcBorders>
+              <w:bottom w:val="single" w:sz="4" w:space="0" w:color="999999"/>
+              <w:top w:val="none" w:sz="0" w:space="0" w:color="000000"/>
+              <w:left w:val="none" w:sz="0" w:space="0" w:color="000000"/>
+              <w:right w:val="none" w:sz="0" w:space="0" w:color="000000"/>
+            </w:tcBorders>
+            <w:shd w:val="clear" w:color="auto" w:fill="FFFFFF"/>
+            <w:tcMar>
+              <w:top w:w="0" w:type="dxa"/>
+              <w:bottom w:w="0" w:type="dxa"/>
+              <w:left w:w="0" w:type="dxa"/>
+              <w:right w:w="0" w:type="dxa"/>
+            </w:tcMar>
+            <w:vAlign w:val="center"/>
+          </w:tcPr>
+          <w:p>
+            <w:pPr>
+              <w:pStyle w:val="Normal"/>
+              <w:jc w:val="center"/>
+              <w:pBdr>
+                <w:bottom w:val="none" w:sz="0" w:space="0" w:color="000000"/>
+                <w:top w:val="none" w:sz="0" w:space="0" w:color="000000"/>
+                <w:left w:val="none" w:sz="0" w:space="0" w:color="000000"/>
+                <w:right w:val="none" w:sz="0" w:space="0" w:color="000000"/>
+              </w:pBdr>
+              <w:spacing w:after="40" w:before="40" w:line="240"/>
+              <w:ind w:left="40" w:right="40" w:firstLine="0" w:firstLineChars="0"/>
+            </w:pPr>
+            <w:r>
+              <w:rPr>
+                <w:rFonts w:ascii="Calibri" w:hAnsi="Calibri" w:eastAsia="Calibri" w:cs="Calibri"/>
+                <w:i w:val="false"/>
+                <w:b w:val="false"/>
+                <w:u w:val="none"/>
+                <w:sz w:val="16"/>
+                <w:szCs w:val="16"/>
+                <w:color w:val="000000"/>
+              </w:rPr>
               <w:t xml:space="preserve">not converged</w:t>
             </w:r>
           </w:p>
@@ -38000,6 +41388,50 @@
                 <w:szCs w:val="16"/>
                 <w:color w:val="000000"/>
               </w:rPr>
+              <w:t xml:space="preserve">lme</w:t>
+            </w:r>
+          </w:p>
+        </w:tc>
+        <w:tc>
+          <w:tcPr>
+            <w:tcBorders>
+              <w:bottom w:val="none" w:sz="0" w:space="0" w:color="000000"/>
+              <w:top w:val="single" w:sz="4" w:space="0" w:color="999999"/>
+              <w:left w:val="none" w:sz="0" w:space="0" w:color="000000"/>
+              <w:right w:val="none" w:sz="0" w:space="0" w:color="000000"/>
+            </w:tcBorders>
+            <w:shd w:val="clear" w:color="auto" w:fill="FFFFFF"/>
+            <w:tcMar>
+              <w:top w:w="0" w:type="dxa"/>
+              <w:bottom w:w="0" w:type="dxa"/>
+              <w:left w:w="0" w:type="dxa"/>
+              <w:right w:w="0" w:type="dxa"/>
+            </w:tcMar>
+            <w:vAlign w:val="center"/>
+          </w:tcPr>
+          <w:p>
+            <w:pPr>
+              <w:pStyle w:val="Normal"/>
+              <w:jc w:val="center"/>
+              <w:pBdr>
+                <w:bottom w:val="none" w:sz="0" w:space="0" w:color="000000"/>
+                <w:top w:val="none" w:sz="0" w:space="0" w:color="000000"/>
+                <w:left w:val="none" w:sz="0" w:space="0" w:color="000000"/>
+                <w:right w:val="none" w:sz="0" w:space="0" w:color="000000"/>
+              </w:pBdr>
+              <w:spacing w:after="40" w:before="40" w:line="240"/>
+              <w:ind w:left="40" w:right="40" w:firstLine="0" w:firstLineChars="0"/>
+            </w:pPr>
+            <w:r>
+              <w:rPr>
+                <w:rFonts w:ascii="Calibri" w:hAnsi="Calibri" w:eastAsia="Calibri" w:cs="Calibri"/>
+                <w:i w:val="false"/>
+                <w:b w:val="false"/>
+                <w:u w:val="none"/>
+                <w:sz w:val="16"/>
+                <w:szCs w:val="16"/>
+                <w:color w:val="000000"/>
+              </w:rPr>
               <w:t xml:space="preserve">0.695</w:t>
             </w:r>
           </w:p>
@@ -38490,6 +41922,50 @@
                 <w:szCs w:val="16"/>
                 <w:color w:val="000000"/>
               </w:rPr>
+              <w:t xml:space="preserve"/>
+            </w:r>
+          </w:p>
+        </w:tc>
+        <w:tc>
+          <w:tcPr>
+            <w:tcBorders>
+              <w:bottom w:val="none" w:sz="0" w:space="0" w:color="000000"/>
+              <w:top w:val="none" w:sz="0" w:space="0" w:color="000000"/>
+              <w:left w:val="none" w:sz="0" w:space="0" w:color="000000"/>
+              <w:right w:val="none" w:sz="0" w:space="0" w:color="000000"/>
+            </w:tcBorders>
+            <w:shd w:val="clear" w:color="auto" w:fill="FFFFFF"/>
+            <w:tcMar>
+              <w:top w:w="0" w:type="dxa"/>
+              <w:bottom w:w="0" w:type="dxa"/>
+              <w:left w:w="0" w:type="dxa"/>
+              <w:right w:w="0" w:type="dxa"/>
+            </w:tcMar>
+            <w:vAlign w:val="center"/>
+          </w:tcPr>
+          <w:p>
+            <w:pPr>
+              <w:pStyle w:val="Normal"/>
+              <w:jc w:val="center"/>
+              <w:pBdr>
+                <w:bottom w:val="none" w:sz="0" w:space="0" w:color="000000"/>
+                <w:top w:val="none" w:sz="0" w:space="0" w:color="000000"/>
+                <w:left w:val="none" w:sz="0" w:space="0" w:color="000000"/>
+                <w:right w:val="none" w:sz="0" w:space="0" w:color="000000"/>
+              </w:pBdr>
+              <w:spacing w:after="40" w:before="40" w:line="240"/>
+              <w:ind w:left="40" w:right="40" w:firstLine="0" w:firstLineChars="0"/>
+            </w:pPr>
+            <w:r>
+              <w:rPr>
+                <w:rFonts w:ascii="Calibri" w:hAnsi="Calibri" w:eastAsia="Calibri" w:cs="Calibri"/>
+                <w:i w:val="false"/>
+                <w:b w:val="false"/>
+                <w:u w:val="none"/>
+                <w:sz w:val="16"/>
+                <w:szCs w:val="16"/>
+                <w:color w:val="000000"/>
+              </w:rPr>
               <w:t xml:space="preserve">not converged</w:t>
             </w:r>
           </w:p>
@@ -38980,6 +42456,50 @@
                 <w:szCs w:val="16"/>
                 <w:color w:val="000000"/>
               </w:rPr>
+              <w:t xml:space="preserve"/>
+            </w:r>
+          </w:p>
+        </w:tc>
+        <w:tc>
+          <w:tcPr>
+            <w:tcBorders>
+              <w:bottom w:val="single" w:sz="4" w:space="0" w:color="999999"/>
+              <w:top w:val="none" w:sz="0" w:space="0" w:color="000000"/>
+              <w:left w:val="none" w:sz="0" w:space="0" w:color="000000"/>
+              <w:right w:val="none" w:sz="0" w:space="0" w:color="000000"/>
+            </w:tcBorders>
+            <w:shd w:val="clear" w:color="auto" w:fill="FFFFFF"/>
+            <w:tcMar>
+              <w:top w:w="0" w:type="dxa"/>
+              <w:bottom w:w="0" w:type="dxa"/>
+              <w:left w:w="0" w:type="dxa"/>
+              <w:right w:w="0" w:type="dxa"/>
+            </w:tcMar>
+            <w:vAlign w:val="center"/>
+          </w:tcPr>
+          <w:p>
+            <w:pPr>
+              <w:pStyle w:val="Normal"/>
+              <w:jc w:val="center"/>
+              <w:pBdr>
+                <w:bottom w:val="none" w:sz="0" w:space="0" w:color="000000"/>
+                <w:top w:val="none" w:sz="0" w:space="0" w:color="000000"/>
+                <w:left w:val="none" w:sz="0" w:space="0" w:color="000000"/>
+                <w:right w:val="none" w:sz="0" w:space="0" w:color="000000"/>
+              </w:pBdr>
+              <w:spacing w:after="40" w:before="40" w:line="240"/>
+              <w:ind w:left="40" w:right="40" w:firstLine="0" w:firstLineChars="0"/>
+            </w:pPr>
+            <w:r>
+              <w:rPr>
+                <w:rFonts w:ascii="Calibri" w:hAnsi="Calibri" w:eastAsia="Calibri" w:cs="Calibri"/>
+                <w:i w:val="false"/>
+                <w:b w:val="false"/>
+                <w:u w:val="none"/>
+                <w:sz w:val="16"/>
+                <w:szCs w:val="16"/>
+                <w:color w:val="000000"/>
+              </w:rPr>
               <w:t xml:space="preserve">not converged</w:t>
             </w:r>
           </w:p>
@@ -39470,6 +42990,50 @@
                 <w:szCs w:val="16"/>
                 <w:color w:val="000000"/>
               </w:rPr>
+              <w:t xml:space="preserve">lme</w:t>
+            </w:r>
+          </w:p>
+        </w:tc>
+        <w:tc>
+          <w:tcPr>
+            <w:tcBorders>
+              <w:bottom w:val="none" w:sz="0" w:space="0" w:color="000000"/>
+              <w:top w:val="single" w:sz="4" w:space="0" w:color="999999"/>
+              <w:left w:val="none" w:sz="0" w:space="0" w:color="000000"/>
+              <w:right w:val="none" w:sz="0" w:space="0" w:color="000000"/>
+            </w:tcBorders>
+            <w:shd w:val="clear" w:color="auto" w:fill="FFFFFF"/>
+            <w:tcMar>
+              <w:top w:w="0" w:type="dxa"/>
+              <w:bottom w:w="0" w:type="dxa"/>
+              <w:left w:w="0" w:type="dxa"/>
+              <w:right w:w="0" w:type="dxa"/>
+            </w:tcMar>
+            <w:vAlign w:val="center"/>
+          </w:tcPr>
+          <w:p>
+            <w:pPr>
+              <w:pStyle w:val="Normal"/>
+              <w:jc w:val="center"/>
+              <w:pBdr>
+                <w:bottom w:val="none" w:sz="0" w:space="0" w:color="000000"/>
+                <w:top w:val="none" w:sz="0" w:space="0" w:color="000000"/>
+                <w:left w:val="none" w:sz="0" w:space="0" w:color="000000"/>
+                <w:right w:val="none" w:sz="0" w:space="0" w:color="000000"/>
+              </w:pBdr>
+              <w:spacing w:after="40" w:before="40" w:line="240"/>
+              <w:ind w:left="40" w:right="40" w:firstLine="0" w:firstLineChars="0"/>
+            </w:pPr>
+            <w:r>
+              <w:rPr>
+                <w:rFonts w:ascii="Calibri" w:hAnsi="Calibri" w:eastAsia="Calibri" w:cs="Calibri"/>
+                <w:i w:val="false"/>
+                <w:b w:val="false"/>
+                <w:u w:val="none"/>
+                <w:sz w:val="16"/>
+                <w:szCs w:val="16"/>
+                <w:color w:val="000000"/>
+              </w:rPr>
               <w:t xml:space="preserve">0.664</w:t>
             </w:r>
           </w:p>
@@ -39960,6 +43524,50 @@
                 <w:szCs w:val="16"/>
                 <w:color w:val="000000"/>
               </w:rPr>
+              <w:t xml:space="preserve"/>
+            </w:r>
+          </w:p>
+        </w:tc>
+        <w:tc>
+          <w:tcPr>
+            <w:tcBorders>
+              <w:bottom w:val="none" w:sz="0" w:space="0" w:color="000000"/>
+              <w:top w:val="none" w:sz="0" w:space="0" w:color="000000"/>
+              <w:left w:val="none" w:sz="0" w:space="0" w:color="000000"/>
+              <w:right w:val="none" w:sz="0" w:space="0" w:color="000000"/>
+            </w:tcBorders>
+            <w:shd w:val="clear" w:color="auto" w:fill="FFFFFF"/>
+            <w:tcMar>
+              <w:top w:w="0" w:type="dxa"/>
+              <w:bottom w:w="0" w:type="dxa"/>
+              <w:left w:w="0" w:type="dxa"/>
+              <w:right w:w="0" w:type="dxa"/>
+            </w:tcMar>
+            <w:vAlign w:val="center"/>
+          </w:tcPr>
+          <w:p>
+            <w:pPr>
+              <w:pStyle w:val="Normal"/>
+              <w:jc w:val="center"/>
+              <w:pBdr>
+                <w:bottom w:val="none" w:sz="0" w:space="0" w:color="000000"/>
+                <w:top w:val="none" w:sz="0" w:space="0" w:color="000000"/>
+                <w:left w:val="none" w:sz="0" w:space="0" w:color="000000"/>
+                <w:right w:val="none" w:sz="0" w:space="0" w:color="000000"/>
+              </w:pBdr>
+              <w:spacing w:after="40" w:before="40" w:line="240"/>
+              <w:ind w:left="40" w:right="40" w:firstLine="0" w:firstLineChars="0"/>
+            </w:pPr>
+            <w:r>
+              <w:rPr>
+                <w:rFonts w:ascii="Calibri" w:hAnsi="Calibri" w:eastAsia="Calibri" w:cs="Calibri"/>
+                <w:i w:val="false"/>
+                <w:b w:val="false"/>
+                <w:u w:val="none"/>
+                <w:sz w:val="16"/>
+                <w:szCs w:val="16"/>
+                <w:color w:val="000000"/>
+              </w:rPr>
               <w:t xml:space="preserve">not converged</w:t>
             </w:r>
           </w:p>
@@ -40407,6 +44015,50 @@
                 <w:color w:val="000000"/>
               </w:rPr>
               <w:t xml:space="preserve">Linear-plateau</w:t>
+            </w:r>
+          </w:p>
+        </w:tc>
+        <w:tc>
+          <w:tcPr>
+            <w:tcBorders>
+              <w:bottom w:val="single" w:sz="8" w:space="0" w:color="000000"/>
+              <w:top w:val="none" w:sz="0" w:space="0" w:color="000000"/>
+              <w:left w:val="none" w:sz="0" w:space="0" w:color="000000"/>
+              <w:right w:val="none" w:sz="0" w:space="0" w:color="000000"/>
+            </w:tcBorders>
+            <w:shd w:val="clear" w:color="auto" w:fill="FFFFFF"/>
+            <w:tcMar>
+              <w:top w:w="0" w:type="dxa"/>
+              <w:bottom w:w="0" w:type="dxa"/>
+              <w:left w:w="0" w:type="dxa"/>
+              <w:right w:w="0" w:type="dxa"/>
+            </w:tcMar>
+            <w:vAlign w:val="center"/>
+          </w:tcPr>
+          <w:p>
+            <w:pPr>
+              <w:pStyle w:val="Normal"/>
+              <w:jc w:val="center"/>
+              <w:pBdr>
+                <w:bottom w:val="none" w:sz="0" w:space="0" w:color="000000"/>
+                <w:top w:val="none" w:sz="0" w:space="0" w:color="000000"/>
+                <w:left w:val="none" w:sz="0" w:space="0" w:color="000000"/>
+                <w:right w:val="none" w:sz="0" w:space="0" w:color="000000"/>
+              </w:pBdr>
+              <w:spacing w:after="40" w:before="40" w:line="240"/>
+              <w:ind w:left="40" w:right="40" w:firstLine="0" w:firstLineChars="0"/>
+            </w:pPr>
+            <w:r>
+              <w:rPr>
+                <w:rFonts w:ascii="Calibri" w:hAnsi="Calibri" w:eastAsia="Calibri" w:cs="Calibri"/>
+                <w:i w:val="false"/>
+                <w:b w:val="false"/>
+                <w:u w:val="none"/>
+                <w:sz w:val="16"/>
+                <w:szCs w:val="16"/>
+                <w:color w:val="000000"/>
+              </w:rPr>
+              <w:t xml:space="preserve"/>
             </w:r>
           </w:p>
         </w:tc>

</xml_diff>